<commit_message>
updated spread writeup and predictions
</commit_message>
<xml_diff>
--- a/Spread Writeup.docx
+++ b/Spread Writeup.docx
@@ -34,15 +34,59 @@
     <w:p>
       <w:pPr>
         <w:rPr>
+          <w:u w:val="single"/>
+        </w:rPr>
+      </w:pPr>
+      <w:r>
+        <w:rPr>
+          <w:u w:val="single"/>
+          <w:rtl w:val="0"/>
+        </w:rPr>
+        <w:t xml:space="preserve">Overview &amp; Approach</w:t>
+      </w:r>
+    </w:p>
+    <w:p>
+      <w:pPr>
+        <w:rPr/>
+      </w:pPr>
+      <w:r>
+        <w:rPr>
+          <w:rtl w:val="0"/>
+        </w:rPr>
+      </w:r>
+    </w:p>
+    <w:p>
+      <w:pPr>
+        <w:rPr/>
+      </w:pPr>
+      <w:r>
+        <w:rPr>
+          <w:rtl w:val="0"/>
+        </w:rPr>
+        <w:t xml:space="preserve">For all spread analysis, we chose to start our training and testing periods at the beginning of the master dataset (10/19/2021). We knew that we wanted to remove all observations before the bubble because we identified that the fast-paced evolution of the NBA would cause prior data to not be as accurate for predicting the style and officiating of today's game. Stats from the deadball era, for example, could cause systematic low spread values because of the slower pace of play and the totals from that time. Models were tested on a 5-fold CV to tune parameters and hyperparameters without lookahead bias and a held-out test set of January 14th - February 19th, with features frozen to January 14th values to mimic the final prediction requirements. </w:t>
+      </w:r>
+    </w:p>
+    <w:p>
+      <w:pPr>
+        <w:rPr>
           <w:b w:val="1"/>
           <w:bCs w:val="1"/>
+        </w:rPr>
+      </w:pPr>
+      <w:r>
+        <w:rPr>
+          <w:rtl w:val="0"/>
+        </w:rPr>
+      </w:r>
+    </w:p>
+    <w:p>
+      <w:pPr>
+        <w:rPr>
           <w:u w:val="single"/>
         </w:rPr>
       </w:pPr>
       <w:r>
         <w:rPr>
-          <w:b w:val="1"/>
-          <w:bCs w:val="1"/>
           <w:u w:val="single"/>
           <w:rtl w:val="0"/>
         </w:rPr>
@@ -51,26 +95,12 @@
     </w:p>
     <w:p>
       <w:pPr>
-        <w:rPr>
-          <w:b w:val="1"/>
-          <w:bCs w:val="1"/>
-        </w:rPr>
-      </w:pPr>
-      <w:r>
-        <w:rPr>
-          <w:rtl w:val="0"/>
-        </w:rPr>
-      </w:r>
-    </w:p>
-    <w:p>
-      <w:pPr>
         <w:rPr/>
       </w:pPr>
       <w:r>
         <w:rPr>
           <w:rtl w:val="0"/>
         </w:rPr>
-        <w:t xml:space="preserve">For all the analysis of the spread, we chose to begin our training and testing period at the beginning of the master dataset (10/19/2021). We knew that we wanted to remove all observations before the bubble because we identified that the fast-paced evolution of the NBA would cause prior data to not be as accurate for predicting the style and officiating of today's game. Stats from the deadball area, for example, could cause systematic low spread values because of the slower pace of play and totals from then. We decided on a simple 80/20 chronological split for simplicity and to maintain the element of predicting for the future that the final predictions would require.</w:t>
       </w:r>
     </w:p>
     <w:p>
@@ -81,6 +111,7 @@
         <w:rPr>
           <w:rtl w:val="0"/>
         </w:rPr>
+        <w:t xml:space="preserve">The naive baseline we used was the average margin for the home team minus the average margin for the away team, divided by 2. We chose this method to simply estimate team strengths and to have an error value to improve upon. Analysis of this naive approach over the selected time period showed a CV MAE of 11.8681 and a test MAE of 12.436.</w:t>
       </w:r>
     </w:p>
     <w:p>
@@ -91,7 +122,6 @@
         <w:rPr>
           <w:rtl w:val="0"/>
         </w:rPr>
-        <w:t xml:space="preserve">The naive baseline that we used as a baseline was the average margin for the home team subtracted by the average margin of the away team, divided by 2. We chose this approach as a way to simply estimate team strengths and give us an error value to work towards improving. Analysis of this naive method across the selected time frame resulted in an MAE of 12.436.</w:t>
       </w:r>
     </w:p>
     <w:p>
@@ -102,6 +132,7 @@
         <w:rPr>
           <w:rtl w:val="0"/>
         </w:rPr>
+        <w:t xml:space="preserve">The base features that we ultimately selected were elo_diff, netrating_diff, offRating_diff, defRating_diff, pace_diff, diff_last5_margin, rest_diff, and home indicator. We felt that this would present us with a good baseline of relative team strength, recent form, and scheduling factors like location and fatigue from little rest. Additionally, pace was included, as teams that play faster will exaggerate their advantage or disadvantage in the final spread through more possessions. We ran a linear regression with those eight base features with the same split and got a CV MAE of 11.2246 and a test MAE of 14.3503 (features became stale very quickly).</w:t>
       </w:r>
     </w:p>
     <w:p>
@@ -112,7 +143,32 @@
         <w:rPr>
           <w:rtl w:val="0"/>
         </w:rPr>
-        <w:t xml:space="preserve">The base features that we ultimately selected were elo_diff, netrating_diff, offRating_diff, defRating_diff, pace_diff, diff_last5_margin, rest_diff, and home indicator. We felt that this would present us a good baseline of relative team strength, recent form, and scheduling factors like location and fatigue from little rest. Additionally, pace was included, as teams that play faster will exaggerate their advantage or disadvantage in the final spread through more possessions. We ran a linear regression with those eight base features with the same 80/20 split and got a test MAE of 11.7605.</w:t>
+      </w:r>
+    </w:p>
+    <w:p>
+      <w:pPr>
+        <w:rPr>
+          <w:u w:val="single"/>
+        </w:rPr>
+      </w:pPr>
+      <w:r>
+        <w:rPr>
+          <w:u w:val="single"/>
+          <w:rtl w:val="0"/>
+        </w:rPr>
+        <w:t xml:space="preserve">Feature Selection</w:t>
+      </w:r>
+    </w:p>
+    <w:p>
+      <w:pPr>
+        <w:rPr>
+          <w:u w:val="single"/>
+        </w:rPr>
+      </w:pPr>
+      <w:r>
+        <w:rPr>
+          <w:rtl w:val="0"/>
+        </w:rPr>
       </w:r>
     </w:p>
     <w:p>
@@ -123,6 +179,7 @@
         <w:rPr>
           <w:rtl w:val="0"/>
         </w:rPr>
+        <w:t xml:space="preserve">Since we were predicting future games, all features chosen for modeling would have to be available prior to tip-off. Features were selected to take into account a team's form, scheduling factors, and historical performance to generate a final spread value.</w:t>
       </w:r>
     </w:p>
     <w:p>
@@ -133,20 +190,6 @@
       </w:pPr>
       <w:r>
         <w:rPr>
-          <w:u w:val="single"/>
-          <w:rtl w:val="0"/>
-        </w:rPr>
-        <w:t xml:space="preserve">Feature Selection</w:t>
-      </w:r>
-    </w:p>
-    <w:p>
-      <w:pPr>
-        <w:rPr>
-          <w:u w:val="single"/>
-        </w:rPr>
-      </w:pPr>
-      <w:r>
-        <w:rPr>
           <w:rtl w:val="0"/>
         </w:rPr>
       </w:r>
@@ -159,7 +202,7 @@
         <w:rPr>
           <w:rtl w:val="0"/>
         </w:rPr>
-        <w:t xml:space="preserve">For further feature selection, we decided to use a lasso-based regularization and to run an alpha sweep to help us balance the relationship between test mae and the number of kept variables.</w:t>
+        <w:t xml:space="preserve">For feature selection, we decided to use lasso-based regularization and to run an alpha sweep to help us balance the relationship between test MAE and the number of kept variables.</w:t>
       </w:r>
     </w:p>
     <w:p>
@@ -178,7 +221,7 @@
       <w:pPr>
         <w:numPr>
           <w:ilvl w:val="0"/>
-          <w:numId w:val="4"/>
+          <w:numId w:val="3"/>
         </w:numPr>
         <w:pBdr>
           <w:top w:color="auto" w:space="0" w:sz="0" w:val="none"/>
@@ -200,7 +243,7 @@
       <w:pPr>
         <w:numPr>
           <w:ilvl w:val="0"/>
-          <w:numId w:val="4"/>
+          <w:numId w:val="3"/>
         </w:numPr>
         <w:pBdr>
           <w:top w:color="auto" w:space="0" w:sz="0" w:val="none"/>
@@ -222,7 +265,7 @@
       <w:pPr>
         <w:numPr>
           <w:ilvl w:val="0"/>
-          <w:numId w:val="4"/>
+          <w:numId w:val="3"/>
         </w:numPr>
         <w:pBdr>
           <w:top w:color="auto" w:space="0" w:sz="0" w:val="none"/>
@@ -244,7 +287,7 @@
       <w:pPr>
         <w:numPr>
           <w:ilvl w:val="0"/>
-          <w:numId w:val="4"/>
+          <w:numId w:val="3"/>
         </w:numPr>
         <w:pBdr>
           <w:top w:color="auto" w:space="0" w:sz="0" w:val="none"/>
@@ -266,7 +309,7 @@
       <w:pPr>
         <w:numPr>
           <w:ilvl w:val="0"/>
-          <w:numId w:val="4"/>
+          <w:numId w:val="3"/>
         </w:numPr>
         <w:pBdr>
           <w:top w:color="auto" w:space="0" w:sz="0" w:val="none"/>
@@ -291,7 +334,7 @@
       <w:pPr>
         <w:numPr>
           <w:ilvl w:val="0"/>
-          <w:numId w:val="4"/>
+          <w:numId w:val="3"/>
         </w:numPr>
         <w:pBdr>
           <w:top w:color="auto" w:space="0" w:sz="0" w:val="none"/>
@@ -317,7 +360,7 @@
         <w:rPr>
           <w:rtl w:val="0"/>
         </w:rPr>
-        <w:t xml:space="preserve">For the lagged features, I ran a lasso regression with a roll of 5, 10, 20, and 30 and got back the same efficiency features (3pa rate, ts). When fitting the linear model, I tried the same rolling numbers with the selected efficiency features and found a lagged value of 20 was the best for MAE.</w:t>
+        <w:t xml:space="preserve">For the lagged features, I ran a lasso regression with a window of 5, 10, 20, and 30, and got back the same efficiency features (3pa rate and ts). When fitting the linear model, I tried the same rolling windows with the selected efficiency features and found a lagged value of 20 was the best for MAE.</w:t>
       </w:r>
     </w:p>
     <w:p>
@@ -342,6 +385,29 @@
           <w:rtl w:val="0"/>
         </w:rPr>
         <w:t xml:space="preserve">Selected Features</w:t>
+      </w:r>
+    </w:p>
+    <w:p>
+      <w:pPr>
+        <w:rPr>
+          <w:u w:val="single"/>
+        </w:rPr>
+      </w:pPr>
+      <w:r>
+        <w:rPr>
+          <w:rtl w:val="0"/>
+        </w:rPr>
+      </w:r>
+    </w:p>
+    <w:p>
+      <w:pPr>
+        <w:rPr/>
+      </w:pPr>
+      <w:r>
+        <w:rPr>
+          <w:rtl w:val="0"/>
+        </w:rPr>
+        <w:t xml:space="preserve">After evaluating the relationship between kept variables and held-out MAE, we ultimately decided on using a lasso regression with an alpha of 0.15 to select the most relevant features for use in future models.</w:t>
       </w:r>
     </w:p>
     <w:p>
@@ -763,39 +829,6 @@
     </w:p>
     <w:p>
       <w:pPr>
-        <w:rPr/>
-      </w:pPr>
-      <w:r>
-        <w:rPr>
-          <w:rtl w:val="0"/>
-        </w:rPr>
-        <w:t xml:space="preserve">Model                         Train MAE   Test MAE</w:t>
-      </w:r>
-    </w:p>
-    <w:p>
-      <w:pPr>
-        <w:rPr/>
-      </w:pPr>
-      <w:r>
-        <w:rPr>
-          <w:rtl w:val="0"/>
-        </w:rPr>
-        <w:t xml:space="preserve">GradientBoost            10.6455      11.4668</w:t>
-      </w:r>
-    </w:p>
-    <w:p>
-      <w:pPr>
-        <w:rPr/>
-      </w:pPr>
-      <w:r>
-        <w:rPr>
-          <w:rtl w:val="0"/>
-        </w:rPr>
-        <w:t xml:space="preserve">XGBoost                     10.8726      11.5104</w:t>
-      </w:r>
-    </w:p>
-    <w:p>
-      <w:pPr>
         <w:pBdr>
           <w:top w:color="auto" w:space="0" w:sz="0" w:val="none"/>
           <w:bottom w:color="auto" w:space="0" w:sz="0" w:val="none"/>
@@ -809,6 +842,7 @@
         <w:rPr>
           <w:rtl w:val="0"/>
         </w:rPr>
+        <w:t xml:space="preserve">After running a hyperparameter sweep, the result was an XGBoost model with a test MAE of 12.0250, which will be discussed in the best model section.</w:t>
       </w:r>
     </w:p>
     <w:p>
@@ -826,32 +860,1086 @@
         <w:rPr>
           <w:rtl w:val="0"/>
         </w:rPr>
-        <w:t xml:space="preserve">After running a hyperparameter sweep, the result was an XGBoost model with a test MAE of 11.4279, which will be discussed in the best model section.</w:t>
-      </w:r>
-    </w:p>
-    <w:p>
-      <w:pPr>
-        <w:pBdr>
-          <w:top w:color="auto" w:space="0" w:sz="0" w:val="none"/>
-          <w:bottom w:color="auto" w:space="0" w:sz="0" w:val="none"/>
-          <w:right w:color="auto" w:space="0" w:sz="0" w:val="none"/>
-          <w:between w:color="auto" w:space="0" w:sz="0" w:val="none"/>
-        </w:pBdr>
-        <w:spacing w:after="340" w:line="360" w:lineRule="auto"/>
-        <w:rPr/>
-      </w:pPr>
-      <w:r>
-        <w:rPr>
-          <w:rtl w:val="0"/>
-        </w:rPr>
-        <w:t xml:space="preserve">Other attempts that failed to reach that error value were a ridge regression baseline with XGBoost-based residual correction and a more traditional neural network.</w:t>
-      </w:r>
-      <w:r>
-        <w:rPr>
-          <w:rtl w:val="0"/>
-        </w:rPr>
-      </w:r>
-    </w:p>
+        <w:t xml:space="preserve">Other attempts that failed to reach that error value were a ridge regression baseline with XGBoost-based residual correction, elastic net, and MLP.</w:t>
+      </w:r>
+    </w:p>
+    <w:tbl>
+      <w:tblPr>
+        <w:tblStyle w:val="Table1"/>
+        <w:tblW w:w="9360.0" w:type="dxa"/>
+        <w:jc w:val="left"/>
+        <w:tblBorders>
+          <w:top w:color="000000" w:space="0" w:sz="8" w:val="single"/>
+          <w:left w:color="000000" w:space="0" w:sz="8" w:val="single"/>
+          <w:bottom w:color="000000" w:space="0" w:sz="8" w:val="single"/>
+          <w:right w:color="000000" w:space="0" w:sz="8" w:val="single"/>
+          <w:insideH w:color="000000" w:space="0" w:sz="8" w:val="single"/>
+          <w:insideV w:color="000000" w:space="0" w:sz="8" w:val="single"/>
+        </w:tblBorders>
+        <w:tblLayout w:type="fixed"/>
+        <w:tblLook w:val="0600"/>
+      </w:tblPr>
+      <w:tblGrid>
+        <w:gridCol w:w="3120"/>
+        <w:gridCol w:w="3120"/>
+        <w:gridCol w:w="3120"/>
+        <w:tblGridChange w:id="0">
+          <w:tblGrid>
+            <w:gridCol w:w="3120"/>
+            <w:gridCol w:w="3120"/>
+            <w:gridCol w:w="3120"/>
+          </w:tblGrid>
+        </w:tblGridChange>
+      </w:tblGrid>
+      <w:tr>
+        <w:trPr>
+          <w:cantSplit w:val="0"/>
+          <w:tblHeader w:val="0"/>
+        </w:trPr>
+        <w:tc>
+          <w:tcPr>
+            <w:shd w:fill="auto" w:val="clear"/>
+            <w:tcMar>
+              <w:top w:w="100.0" w:type="dxa"/>
+              <w:left w:w="100.0" w:type="dxa"/>
+              <w:bottom w:w="100.0" w:type="dxa"/>
+              <w:right w:w="100.0" w:type="dxa"/>
+            </w:tcMar>
+            <w:vAlign w:val="top"/>
+          </w:tcPr>
+          <w:p>
+            <w:pPr>
+              <w:keepNext w:val="0"/>
+              <w:keepLines w:val="0"/>
+              <w:pageBreakBefore w:val="0"/>
+              <w:widowControl w:val="0"/>
+              <w:pBdr>
+                <w:top w:space="0" w:sz="0" w:val="nil"/>
+                <w:left w:space="0" w:sz="0" w:val="nil"/>
+                <w:bottom w:space="0" w:sz="0" w:val="nil"/>
+                <w:right w:space="0" w:sz="0" w:val="nil"/>
+                <w:between w:space="0" w:sz="0" w:val="nil"/>
+              </w:pBdr>
+              <w:shd w:fill="auto" w:val="clear"/>
+              <w:spacing w:after="0" w:before="0" w:line="240" w:lineRule="auto"/>
+              <w:ind w:left="0" w:right="0" w:firstLine="0"/>
+              <w:jc w:val="left"/>
+              <w:rPr/>
+            </w:pPr>
+            <w:r>
+              <w:rPr>
+                <w:rtl w:val="0"/>
+              </w:rPr>
+              <w:t xml:space="preserve">Model</w:t>
+            </w:r>
+          </w:p>
+        </w:tc>
+        <w:tc>
+          <w:tcPr>
+            <w:shd w:fill="auto" w:val="clear"/>
+            <w:tcMar>
+              <w:top w:w="100.0" w:type="dxa"/>
+              <w:left w:w="100.0" w:type="dxa"/>
+              <w:bottom w:w="100.0" w:type="dxa"/>
+              <w:right w:w="100.0" w:type="dxa"/>
+            </w:tcMar>
+            <w:vAlign w:val="top"/>
+          </w:tcPr>
+          <w:p>
+            <w:pPr>
+              <w:keepNext w:val="0"/>
+              <w:keepLines w:val="0"/>
+              <w:pageBreakBefore w:val="0"/>
+              <w:widowControl w:val="0"/>
+              <w:pBdr>
+                <w:top w:space="0" w:sz="0" w:val="nil"/>
+                <w:left w:space="0" w:sz="0" w:val="nil"/>
+                <w:bottom w:space="0" w:sz="0" w:val="nil"/>
+                <w:right w:space="0" w:sz="0" w:val="nil"/>
+                <w:between w:space="0" w:sz="0" w:val="nil"/>
+              </w:pBdr>
+              <w:shd w:fill="auto" w:val="clear"/>
+              <w:spacing w:after="0" w:before="0" w:line="240" w:lineRule="auto"/>
+              <w:ind w:left="0" w:right="0" w:firstLine="0"/>
+              <w:jc w:val="left"/>
+              <w:rPr/>
+            </w:pPr>
+            <w:r>
+              <w:rPr>
+                <w:rtl w:val="0"/>
+              </w:rPr>
+              <w:t xml:space="preserve">CV MAE</w:t>
+            </w:r>
+          </w:p>
+        </w:tc>
+        <w:tc>
+          <w:tcPr>
+            <w:shd w:fill="auto" w:val="clear"/>
+            <w:tcMar>
+              <w:top w:w="100.0" w:type="dxa"/>
+              <w:left w:w="100.0" w:type="dxa"/>
+              <w:bottom w:w="100.0" w:type="dxa"/>
+              <w:right w:w="100.0" w:type="dxa"/>
+            </w:tcMar>
+            <w:vAlign w:val="top"/>
+          </w:tcPr>
+          <w:p>
+            <w:pPr>
+              <w:keepNext w:val="0"/>
+              <w:keepLines w:val="0"/>
+              <w:pageBreakBefore w:val="0"/>
+              <w:widowControl w:val="0"/>
+              <w:pBdr>
+                <w:top w:space="0" w:sz="0" w:val="nil"/>
+                <w:left w:space="0" w:sz="0" w:val="nil"/>
+                <w:bottom w:space="0" w:sz="0" w:val="nil"/>
+                <w:right w:space="0" w:sz="0" w:val="nil"/>
+                <w:between w:space="0" w:sz="0" w:val="nil"/>
+              </w:pBdr>
+              <w:shd w:fill="auto" w:val="clear"/>
+              <w:spacing w:after="0" w:before="0" w:line="240" w:lineRule="auto"/>
+              <w:ind w:left="0" w:right="0" w:firstLine="0"/>
+              <w:jc w:val="left"/>
+              <w:rPr/>
+            </w:pPr>
+            <w:r>
+              <w:rPr>
+                <w:rtl w:val="0"/>
+              </w:rPr>
+              <w:t xml:space="preserve">Test MAE</w:t>
+            </w:r>
+          </w:p>
+        </w:tc>
+      </w:tr>
+      <w:tr>
+        <w:trPr>
+          <w:cantSplit w:val="0"/>
+          <w:tblHeader w:val="0"/>
+        </w:trPr>
+        <w:tc>
+          <w:tcPr>
+            <w:shd w:fill="auto" w:val="clear"/>
+            <w:tcMar>
+              <w:top w:w="100.0" w:type="dxa"/>
+              <w:left w:w="100.0" w:type="dxa"/>
+              <w:bottom w:w="100.0" w:type="dxa"/>
+              <w:right w:w="100.0" w:type="dxa"/>
+            </w:tcMar>
+            <w:vAlign w:val="top"/>
+          </w:tcPr>
+          <w:p>
+            <w:pPr>
+              <w:keepNext w:val="0"/>
+              <w:keepLines w:val="0"/>
+              <w:pageBreakBefore w:val="0"/>
+              <w:widowControl w:val="0"/>
+              <w:pBdr>
+                <w:top w:space="0" w:sz="0" w:val="nil"/>
+                <w:left w:space="0" w:sz="0" w:val="nil"/>
+                <w:bottom w:space="0" w:sz="0" w:val="nil"/>
+                <w:right w:space="0" w:sz="0" w:val="nil"/>
+                <w:between w:space="0" w:sz="0" w:val="nil"/>
+              </w:pBdr>
+              <w:shd w:fill="auto" w:val="clear"/>
+              <w:spacing w:after="0" w:before="0" w:line="240" w:lineRule="auto"/>
+              <w:ind w:left="0" w:right="0" w:firstLine="0"/>
+              <w:jc w:val="left"/>
+              <w:rPr/>
+            </w:pPr>
+            <w:r>
+              <w:rPr>
+                <w:sz w:val="20"/>
+                <w:szCs w:val="20"/>
+                <w:rtl w:val="0"/>
+              </w:rPr>
+              <w:t xml:space="preserve">XGBoost</w:t>
+            </w:r>
+            <w:r>
+              <w:rPr>
+                <w:rtl w:val="0"/>
+              </w:rPr>
+            </w:r>
+          </w:p>
+        </w:tc>
+        <w:tc>
+          <w:tcPr>
+            <w:shd w:fill="auto" w:val="clear"/>
+            <w:tcMar>
+              <w:top w:w="100.0" w:type="dxa"/>
+              <w:left w:w="100.0" w:type="dxa"/>
+              <w:bottom w:w="100.0" w:type="dxa"/>
+              <w:right w:w="100.0" w:type="dxa"/>
+            </w:tcMar>
+            <w:vAlign w:val="top"/>
+          </w:tcPr>
+          <w:p>
+            <w:pPr>
+              <w:keepNext w:val="0"/>
+              <w:keepLines w:val="0"/>
+              <w:pageBreakBefore w:val="0"/>
+              <w:widowControl w:val="0"/>
+              <w:pBdr>
+                <w:top w:space="0" w:sz="0" w:val="nil"/>
+                <w:left w:space="0" w:sz="0" w:val="nil"/>
+                <w:bottom w:space="0" w:sz="0" w:val="nil"/>
+                <w:right w:space="0" w:sz="0" w:val="nil"/>
+                <w:between w:space="0" w:sz="0" w:val="nil"/>
+              </w:pBdr>
+              <w:shd w:fill="auto" w:val="clear"/>
+              <w:spacing w:after="0" w:before="0" w:line="240" w:lineRule="auto"/>
+              <w:ind w:left="0" w:right="0" w:firstLine="0"/>
+              <w:jc w:val="left"/>
+              <w:rPr/>
+            </w:pPr>
+            <w:r>
+              <w:rPr>
+                <w:rtl w:val="0"/>
+              </w:rPr>
+              <w:t xml:space="preserve">10.989</w:t>
+            </w:r>
+          </w:p>
+        </w:tc>
+        <w:tc>
+          <w:tcPr>
+            <w:shd w:fill="auto" w:val="clear"/>
+            <w:tcMar>
+              <w:top w:w="100.0" w:type="dxa"/>
+              <w:left w:w="100.0" w:type="dxa"/>
+              <w:bottom w:w="100.0" w:type="dxa"/>
+              <w:right w:w="100.0" w:type="dxa"/>
+            </w:tcMar>
+            <w:vAlign w:val="top"/>
+          </w:tcPr>
+          <w:p>
+            <w:pPr>
+              <w:keepNext w:val="0"/>
+              <w:keepLines w:val="0"/>
+              <w:pageBreakBefore w:val="0"/>
+              <w:widowControl w:val="0"/>
+              <w:pBdr>
+                <w:top w:space="0" w:sz="0" w:val="nil"/>
+                <w:left w:space="0" w:sz="0" w:val="nil"/>
+                <w:bottom w:space="0" w:sz="0" w:val="nil"/>
+                <w:right w:space="0" w:sz="0" w:val="nil"/>
+                <w:between w:space="0" w:sz="0" w:val="nil"/>
+              </w:pBdr>
+              <w:shd w:fill="auto" w:val="clear"/>
+              <w:spacing w:after="0" w:before="0" w:line="240" w:lineRule="auto"/>
+              <w:ind w:left="0" w:right="0" w:firstLine="0"/>
+              <w:jc w:val="left"/>
+              <w:rPr/>
+            </w:pPr>
+            <w:r>
+              <w:rPr>
+                <w:rtl w:val="0"/>
+              </w:rPr>
+              <w:t xml:space="preserve">12.0250</w:t>
+            </w:r>
+          </w:p>
+        </w:tc>
+      </w:tr>
+      <w:tr>
+        <w:trPr>
+          <w:cantSplit w:val="0"/>
+          <w:tblHeader w:val="0"/>
+        </w:trPr>
+        <w:tc>
+          <w:tcPr>
+            <w:shd w:fill="auto" w:val="clear"/>
+            <w:tcMar>
+              <w:top w:w="100.0" w:type="dxa"/>
+              <w:left w:w="100.0" w:type="dxa"/>
+              <w:bottom w:w="100.0" w:type="dxa"/>
+              <w:right w:w="100.0" w:type="dxa"/>
+            </w:tcMar>
+            <w:vAlign w:val="top"/>
+          </w:tcPr>
+          <w:p>
+            <w:pPr>
+              <w:keepNext w:val="0"/>
+              <w:keepLines w:val="0"/>
+              <w:pageBreakBefore w:val="0"/>
+              <w:widowControl w:val="0"/>
+              <w:pBdr>
+                <w:top w:space="0" w:sz="0" w:val="nil"/>
+                <w:left w:space="0" w:sz="0" w:val="nil"/>
+                <w:bottom w:space="0" w:sz="0" w:val="nil"/>
+                <w:right w:space="0" w:sz="0" w:val="nil"/>
+                <w:between w:space="0" w:sz="0" w:val="nil"/>
+              </w:pBdr>
+              <w:shd w:fill="auto" w:val="clear"/>
+              <w:spacing w:after="0" w:before="0" w:line="240" w:lineRule="auto"/>
+              <w:ind w:left="0" w:right="0" w:firstLine="0"/>
+              <w:jc w:val="left"/>
+              <w:rPr/>
+            </w:pPr>
+            <w:r>
+              <w:rPr>
+                <w:rtl w:val="0"/>
+              </w:rPr>
+              <w:t xml:space="preserve">MLP 64 -&gt; 32</w:t>
+            </w:r>
+          </w:p>
+        </w:tc>
+        <w:tc>
+          <w:tcPr>
+            <w:shd w:fill="auto" w:val="clear"/>
+            <w:tcMar>
+              <w:top w:w="100.0" w:type="dxa"/>
+              <w:left w:w="100.0" w:type="dxa"/>
+              <w:bottom w:w="100.0" w:type="dxa"/>
+              <w:right w:w="100.0" w:type="dxa"/>
+            </w:tcMar>
+            <w:vAlign w:val="top"/>
+          </w:tcPr>
+          <w:p>
+            <w:pPr>
+              <w:keepNext w:val="0"/>
+              <w:keepLines w:val="0"/>
+              <w:pageBreakBefore w:val="0"/>
+              <w:widowControl w:val="0"/>
+              <w:pBdr>
+                <w:top w:space="0" w:sz="0" w:val="nil"/>
+                <w:left w:space="0" w:sz="0" w:val="nil"/>
+                <w:bottom w:space="0" w:sz="0" w:val="nil"/>
+                <w:right w:space="0" w:sz="0" w:val="nil"/>
+                <w:between w:space="0" w:sz="0" w:val="nil"/>
+              </w:pBdr>
+              <w:shd w:fill="auto" w:val="clear"/>
+              <w:spacing w:after="0" w:before="0" w:line="240" w:lineRule="auto"/>
+              <w:ind w:left="0" w:right="0" w:firstLine="0"/>
+              <w:jc w:val="left"/>
+              <w:rPr/>
+            </w:pPr>
+            <w:r>
+              <w:rPr>
+                <w:rtl w:val="0"/>
+              </w:rPr>
+              <w:t xml:space="preserve">11.0920</w:t>
+            </w:r>
+          </w:p>
+        </w:tc>
+        <w:tc>
+          <w:tcPr>
+            <w:shd w:fill="auto" w:val="clear"/>
+            <w:tcMar>
+              <w:top w:w="100.0" w:type="dxa"/>
+              <w:left w:w="100.0" w:type="dxa"/>
+              <w:bottom w:w="100.0" w:type="dxa"/>
+              <w:right w:w="100.0" w:type="dxa"/>
+            </w:tcMar>
+            <w:vAlign w:val="top"/>
+          </w:tcPr>
+          <w:p>
+            <w:pPr>
+              <w:keepNext w:val="0"/>
+              <w:keepLines w:val="0"/>
+              <w:pageBreakBefore w:val="0"/>
+              <w:widowControl w:val="0"/>
+              <w:pBdr>
+                <w:top w:space="0" w:sz="0" w:val="nil"/>
+                <w:left w:space="0" w:sz="0" w:val="nil"/>
+                <w:bottom w:space="0" w:sz="0" w:val="nil"/>
+                <w:right w:space="0" w:sz="0" w:val="nil"/>
+                <w:between w:space="0" w:sz="0" w:val="nil"/>
+              </w:pBdr>
+              <w:shd w:fill="auto" w:val="clear"/>
+              <w:spacing w:after="0" w:before="0" w:line="240" w:lineRule="auto"/>
+              <w:ind w:left="0" w:right="0" w:firstLine="0"/>
+              <w:jc w:val="left"/>
+              <w:rPr/>
+            </w:pPr>
+            <w:r>
+              <w:rPr>
+                <w:rtl w:val="0"/>
+              </w:rPr>
+              <w:t xml:space="preserve">12.0438</w:t>
+            </w:r>
+          </w:p>
+        </w:tc>
+      </w:tr>
+      <w:tr>
+        <w:trPr>
+          <w:cantSplit w:val="0"/>
+          <w:tblHeader w:val="0"/>
+        </w:trPr>
+        <w:tc>
+          <w:tcPr>
+            <w:shd w:fill="auto" w:val="clear"/>
+            <w:tcMar>
+              <w:top w:w="100.0" w:type="dxa"/>
+              <w:left w:w="100.0" w:type="dxa"/>
+              <w:bottom w:w="100.0" w:type="dxa"/>
+              <w:right w:w="100.0" w:type="dxa"/>
+            </w:tcMar>
+            <w:vAlign w:val="top"/>
+          </w:tcPr>
+          <w:p>
+            <w:pPr>
+              <w:keepNext w:val="0"/>
+              <w:keepLines w:val="0"/>
+              <w:pageBreakBefore w:val="0"/>
+              <w:widowControl w:val="0"/>
+              <w:pBdr>
+                <w:top w:space="0" w:sz="0" w:val="nil"/>
+                <w:left w:space="0" w:sz="0" w:val="nil"/>
+                <w:bottom w:space="0" w:sz="0" w:val="nil"/>
+                <w:right w:space="0" w:sz="0" w:val="nil"/>
+                <w:between w:space="0" w:sz="0" w:val="nil"/>
+              </w:pBdr>
+              <w:shd w:fill="auto" w:val="clear"/>
+              <w:spacing w:after="0" w:before="0" w:line="240" w:lineRule="auto"/>
+              <w:ind w:left="0" w:right="0" w:firstLine="0"/>
+              <w:jc w:val="left"/>
+              <w:rPr/>
+            </w:pPr>
+            <w:r>
+              <w:rPr>
+                <w:rtl w:val="0"/>
+              </w:rPr>
+              <w:t xml:space="preserve">Ridge alpha=1</w:t>
+            </w:r>
+          </w:p>
+        </w:tc>
+        <w:tc>
+          <w:tcPr>
+            <w:shd w:fill="auto" w:val="clear"/>
+            <w:tcMar>
+              <w:top w:w="100.0" w:type="dxa"/>
+              <w:left w:w="100.0" w:type="dxa"/>
+              <w:bottom w:w="100.0" w:type="dxa"/>
+              <w:right w:w="100.0" w:type="dxa"/>
+            </w:tcMar>
+            <w:vAlign w:val="top"/>
+          </w:tcPr>
+          <w:p>
+            <w:pPr>
+              <w:keepNext w:val="0"/>
+              <w:keepLines w:val="0"/>
+              <w:pageBreakBefore w:val="0"/>
+              <w:widowControl w:val="0"/>
+              <w:pBdr>
+                <w:top w:space="0" w:sz="0" w:val="nil"/>
+                <w:left w:space="0" w:sz="0" w:val="nil"/>
+                <w:bottom w:space="0" w:sz="0" w:val="nil"/>
+                <w:right w:space="0" w:sz="0" w:val="nil"/>
+                <w:between w:space="0" w:sz="0" w:val="nil"/>
+              </w:pBdr>
+              <w:shd w:fill="auto" w:val="clear"/>
+              <w:spacing w:after="0" w:before="0" w:line="240" w:lineRule="auto"/>
+              <w:ind w:left="0" w:right="0" w:firstLine="0"/>
+              <w:jc w:val="left"/>
+              <w:rPr/>
+            </w:pPr>
+            <w:r>
+              <w:rPr>
+                <w:rtl w:val="0"/>
+              </w:rPr>
+              <w:t xml:space="preserve">11.0053</w:t>
+            </w:r>
+          </w:p>
+        </w:tc>
+        <w:tc>
+          <w:tcPr>
+            <w:shd w:fill="auto" w:val="clear"/>
+            <w:tcMar>
+              <w:top w:w="100.0" w:type="dxa"/>
+              <w:left w:w="100.0" w:type="dxa"/>
+              <w:bottom w:w="100.0" w:type="dxa"/>
+              <w:right w:w="100.0" w:type="dxa"/>
+            </w:tcMar>
+            <w:vAlign w:val="top"/>
+          </w:tcPr>
+          <w:p>
+            <w:pPr>
+              <w:keepNext w:val="0"/>
+              <w:keepLines w:val="0"/>
+              <w:pageBreakBefore w:val="0"/>
+              <w:widowControl w:val="0"/>
+              <w:pBdr>
+                <w:top w:space="0" w:sz="0" w:val="nil"/>
+                <w:left w:space="0" w:sz="0" w:val="nil"/>
+                <w:bottom w:space="0" w:sz="0" w:val="nil"/>
+                <w:right w:space="0" w:sz="0" w:val="nil"/>
+                <w:between w:space="0" w:sz="0" w:val="nil"/>
+              </w:pBdr>
+              <w:shd w:fill="auto" w:val="clear"/>
+              <w:spacing w:after="0" w:before="0" w:line="240" w:lineRule="auto"/>
+              <w:ind w:left="0" w:right="0" w:firstLine="0"/>
+              <w:jc w:val="left"/>
+              <w:rPr/>
+            </w:pPr>
+            <w:r>
+              <w:rPr>
+                <w:rtl w:val="0"/>
+              </w:rPr>
+              <w:t xml:space="preserve">12.0629</w:t>
+            </w:r>
+          </w:p>
+        </w:tc>
+      </w:tr>
+      <w:tr>
+        <w:trPr>
+          <w:cantSplit w:val="0"/>
+          <w:tblHeader w:val="0"/>
+        </w:trPr>
+        <w:tc>
+          <w:tcPr>
+            <w:shd w:fill="auto" w:val="clear"/>
+            <w:tcMar>
+              <w:top w:w="100.0" w:type="dxa"/>
+              <w:left w:w="100.0" w:type="dxa"/>
+              <w:bottom w:w="100.0" w:type="dxa"/>
+              <w:right w:w="100.0" w:type="dxa"/>
+            </w:tcMar>
+            <w:vAlign w:val="top"/>
+          </w:tcPr>
+          <w:p>
+            <w:pPr>
+              <w:keepNext w:val="0"/>
+              <w:keepLines w:val="0"/>
+              <w:pageBreakBefore w:val="0"/>
+              <w:widowControl w:val="0"/>
+              <w:pBdr>
+                <w:top w:space="0" w:sz="0" w:val="nil"/>
+                <w:left w:space="0" w:sz="0" w:val="nil"/>
+                <w:bottom w:space="0" w:sz="0" w:val="nil"/>
+                <w:right w:space="0" w:sz="0" w:val="nil"/>
+                <w:between w:space="0" w:sz="0" w:val="nil"/>
+              </w:pBdr>
+              <w:shd w:fill="auto" w:val="clear"/>
+              <w:spacing w:after="0" w:before="0" w:line="240" w:lineRule="auto"/>
+              <w:ind w:left="0" w:right="0" w:firstLine="0"/>
+              <w:jc w:val="left"/>
+              <w:rPr/>
+            </w:pPr>
+            <w:r>
+              <w:rPr>
+                <w:rtl w:val="0"/>
+              </w:rPr>
+              <w:t xml:space="preserve">GradientBoost</w:t>
+            </w:r>
+          </w:p>
+        </w:tc>
+        <w:tc>
+          <w:tcPr>
+            <w:shd w:fill="auto" w:val="clear"/>
+            <w:tcMar>
+              <w:top w:w="100.0" w:type="dxa"/>
+              <w:left w:w="100.0" w:type="dxa"/>
+              <w:bottom w:w="100.0" w:type="dxa"/>
+              <w:right w:w="100.0" w:type="dxa"/>
+            </w:tcMar>
+            <w:vAlign w:val="top"/>
+          </w:tcPr>
+          <w:p>
+            <w:pPr>
+              <w:keepNext w:val="0"/>
+              <w:keepLines w:val="0"/>
+              <w:pageBreakBefore w:val="0"/>
+              <w:widowControl w:val="0"/>
+              <w:pBdr>
+                <w:top w:space="0" w:sz="0" w:val="nil"/>
+                <w:left w:space="0" w:sz="0" w:val="nil"/>
+                <w:bottom w:space="0" w:sz="0" w:val="nil"/>
+                <w:right w:space="0" w:sz="0" w:val="nil"/>
+                <w:between w:space="0" w:sz="0" w:val="nil"/>
+              </w:pBdr>
+              <w:shd w:fill="auto" w:val="clear"/>
+              <w:spacing w:after="0" w:before="0" w:line="240" w:lineRule="auto"/>
+              <w:ind w:left="0" w:right="0" w:firstLine="0"/>
+              <w:jc w:val="left"/>
+              <w:rPr/>
+            </w:pPr>
+            <w:r>
+              <w:rPr>
+                <w:rtl w:val="0"/>
+              </w:rPr>
+              <w:t xml:space="preserve">11.0266</w:t>
+            </w:r>
+          </w:p>
+        </w:tc>
+        <w:tc>
+          <w:tcPr>
+            <w:shd w:fill="auto" w:val="clear"/>
+            <w:tcMar>
+              <w:top w:w="100.0" w:type="dxa"/>
+              <w:left w:w="100.0" w:type="dxa"/>
+              <w:bottom w:w="100.0" w:type="dxa"/>
+              <w:right w:w="100.0" w:type="dxa"/>
+            </w:tcMar>
+            <w:vAlign w:val="top"/>
+          </w:tcPr>
+          <w:p>
+            <w:pPr>
+              <w:keepNext w:val="0"/>
+              <w:keepLines w:val="0"/>
+              <w:pageBreakBefore w:val="0"/>
+              <w:widowControl w:val="0"/>
+              <w:pBdr>
+                <w:top w:space="0" w:sz="0" w:val="nil"/>
+                <w:left w:space="0" w:sz="0" w:val="nil"/>
+                <w:bottom w:space="0" w:sz="0" w:val="nil"/>
+                <w:right w:space="0" w:sz="0" w:val="nil"/>
+                <w:between w:space="0" w:sz="0" w:val="nil"/>
+              </w:pBdr>
+              <w:shd w:fill="auto" w:val="clear"/>
+              <w:spacing w:after="0" w:before="0" w:line="240" w:lineRule="auto"/>
+              <w:ind w:left="0" w:right="0" w:firstLine="0"/>
+              <w:jc w:val="left"/>
+              <w:rPr/>
+            </w:pPr>
+            <w:r>
+              <w:rPr>
+                <w:rtl w:val="0"/>
+              </w:rPr>
+              <w:t xml:space="preserve">12.067</w:t>
+            </w:r>
+          </w:p>
+        </w:tc>
+      </w:tr>
+      <w:tr>
+        <w:trPr>
+          <w:cantSplit w:val="0"/>
+          <w:tblHeader w:val="0"/>
+        </w:trPr>
+        <w:tc>
+          <w:tcPr>
+            <w:shd w:fill="auto" w:val="clear"/>
+            <w:tcMar>
+              <w:top w:w="100.0" w:type="dxa"/>
+              <w:left w:w="100.0" w:type="dxa"/>
+              <w:bottom w:w="100.0" w:type="dxa"/>
+              <w:right w:w="100.0" w:type="dxa"/>
+            </w:tcMar>
+            <w:vAlign w:val="top"/>
+          </w:tcPr>
+          <w:p>
+            <w:pPr>
+              <w:keepNext w:val="0"/>
+              <w:keepLines w:val="0"/>
+              <w:pageBreakBefore w:val="0"/>
+              <w:widowControl w:val="0"/>
+              <w:pBdr>
+                <w:top w:space="0" w:sz="0" w:val="nil"/>
+                <w:left w:space="0" w:sz="0" w:val="nil"/>
+                <w:bottom w:space="0" w:sz="0" w:val="nil"/>
+                <w:right w:space="0" w:sz="0" w:val="nil"/>
+                <w:between w:space="0" w:sz="0" w:val="nil"/>
+              </w:pBdr>
+              <w:shd w:fill="auto" w:val="clear"/>
+              <w:spacing w:after="0" w:before="0" w:line="240" w:lineRule="auto"/>
+              <w:ind w:left="0" w:right="0" w:firstLine="0"/>
+              <w:jc w:val="left"/>
+              <w:rPr/>
+            </w:pPr>
+            <w:r>
+              <w:rPr>
+                <w:rtl w:val="0"/>
+              </w:rPr>
+              <w:t xml:space="preserve">ElasticNet alpha=0.3</w:t>
+            </w:r>
+          </w:p>
+        </w:tc>
+        <w:tc>
+          <w:tcPr>
+            <w:shd w:fill="auto" w:val="clear"/>
+            <w:tcMar>
+              <w:top w:w="100.0" w:type="dxa"/>
+              <w:left w:w="100.0" w:type="dxa"/>
+              <w:bottom w:w="100.0" w:type="dxa"/>
+              <w:right w:w="100.0" w:type="dxa"/>
+            </w:tcMar>
+            <w:vAlign w:val="top"/>
+          </w:tcPr>
+          <w:p>
+            <w:pPr>
+              <w:keepNext w:val="0"/>
+              <w:keepLines w:val="0"/>
+              <w:pageBreakBefore w:val="0"/>
+              <w:widowControl w:val="0"/>
+              <w:pBdr>
+                <w:top w:space="0" w:sz="0" w:val="nil"/>
+                <w:left w:space="0" w:sz="0" w:val="nil"/>
+                <w:bottom w:space="0" w:sz="0" w:val="nil"/>
+                <w:right w:space="0" w:sz="0" w:val="nil"/>
+                <w:between w:space="0" w:sz="0" w:val="nil"/>
+              </w:pBdr>
+              <w:shd w:fill="auto" w:val="clear"/>
+              <w:spacing w:after="0" w:before="0" w:line="240" w:lineRule="auto"/>
+              <w:ind w:left="0" w:right="0" w:firstLine="0"/>
+              <w:jc w:val="left"/>
+              <w:rPr/>
+            </w:pPr>
+            <w:r>
+              <w:rPr>
+                <w:rtl w:val="0"/>
+              </w:rPr>
+              <w:t xml:space="preserve">11.0187</w:t>
+            </w:r>
+          </w:p>
+        </w:tc>
+        <w:tc>
+          <w:tcPr>
+            <w:shd w:fill="auto" w:val="clear"/>
+            <w:tcMar>
+              <w:top w:w="100.0" w:type="dxa"/>
+              <w:left w:w="100.0" w:type="dxa"/>
+              <w:bottom w:w="100.0" w:type="dxa"/>
+              <w:right w:w="100.0" w:type="dxa"/>
+            </w:tcMar>
+            <w:vAlign w:val="top"/>
+          </w:tcPr>
+          <w:p>
+            <w:pPr>
+              <w:keepNext w:val="0"/>
+              <w:keepLines w:val="0"/>
+              <w:pageBreakBefore w:val="0"/>
+              <w:widowControl w:val="0"/>
+              <w:pBdr>
+                <w:top w:space="0" w:sz="0" w:val="nil"/>
+                <w:left w:space="0" w:sz="0" w:val="nil"/>
+                <w:bottom w:space="0" w:sz="0" w:val="nil"/>
+                <w:right w:space="0" w:sz="0" w:val="nil"/>
+                <w:between w:space="0" w:sz="0" w:val="nil"/>
+              </w:pBdr>
+              <w:shd w:fill="auto" w:val="clear"/>
+              <w:spacing w:after="0" w:before="0" w:line="240" w:lineRule="auto"/>
+              <w:ind w:left="0" w:right="0" w:firstLine="0"/>
+              <w:jc w:val="left"/>
+              <w:rPr/>
+            </w:pPr>
+            <w:r>
+              <w:rPr>
+                <w:rtl w:val="0"/>
+              </w:rPr>
+              <w:t xml:space="preserve">12.0744</w:t>
+            </w:r>
+          </w:p>
+        </w:tc>
+      </w:tr>
+      <w:tr>
+        <w:trPr>
+          <w:cantSplit w:val="0"/>
+          <w:tblHeader w:val="0"/>
+        </w:trPr>
+        <w:tc>
+          <w:tcPr>
+            <w:shd w:fill="auto" w:val="clear"/>
+            <w:tcMar>
+              <w:top w:w="100.0" w:type="dxa"/>
+              <w:left w:w="100.0" w:type="dxa"/>
+              <w:bottom w:w="100.0" w:type="dxa"/>
+              <w:right w:w="100.0" w:type="dxa"/>
+            </w:tcMar>
+            <w:vAlign w:val="top"/>
+          </w:tcPr>
+          <w:p>
+            <w:pPr>
+              <w:keepNext w:val="0"/>
+              <w:keepLines w:val="0"/>
+              <w:pageBreakBefore w:val="0"/>
+              <w:widowControl w:val="0"/>
+              <w:pBdr>
+                <w:top w:space="0" w:sz="0" w:val="nil"/>
+                <w:left w:space="0" w:sz="0" w:val="nil"/>
+                <w:bottom w:space="0" w:sz="0" w:val="nil"/>
+                <w:right w:space="0" w:sz="0" w:val="nil"/>
+                <w:between w:space="0" w:sz="0" w:val="nil"/>
+              </w:pBdr>
+              <w:shd w:fill="auto" w:val="clear"/>
+              <w:spacing w:after="0" w:before="0" w:line="240" w:lineRule="auto"/>
+              <w:ind w:left="0" w:right="0" w:firstLine="0"/>
+              <w:jc w:val="left"/>
+              <w:rPr/>
+            </w:pPr>
+            <w:r>
+              <w:rPr>
+                <w:rtl w:val="0"/>
+              </w:rPr>
+              <w:t xml:space="preserve">Ridge + XGBoost residual</w:t>
+            </w:r>
+          </w:p>
+        </w:tc>
+        <w:tc>
+          <w:tcPr>
+            <w:shd w:fill="auto" w:val="clear"/>
+            <w:tcMar>
+              <w:top w:w="100.0" w:type="dxa"/>
+              <w:left w:w="100.0" w:type="dxa"/>
+              <w:bottom w:w="100.0" w:type="dxa"/>
+              <w:right w:w="100.0" w:type="dxa"/>
+            </w:tcMar>
+            <w:vAlign w:val="top"/>
+          </w:tcPr>
+          <w:p>
+            <w:pPr>
+              <w:keepNext w:val="0"/>
+              <w:keepLines w:val="0"/>
+              <w:pageBreakBefore w:val="0"/>
+              <w:widowControl w:val="0"/>
+              <w:pBdr>
+                <w:top w:space="0" w:sz="0" w:val="nil"/>
+                <w:left w:space="0" w:sz="0" w:val="nil"/>
+                <w:bottom w:space="0" w:sz="0" w:val="nil"/>
+                <w:right w:space="0" w:sz="0" w:val="nil"/>
+                <w:between w:space="0" w:sz="0" w:val="nil"/>
+              </w:pBdr>
+              <w:shd w:fill="auto" w:val="clear"/>
+              <w:spacing w:after="0" w:before="0" w:line="240" w:lineRule="auto"/>
+              <w:ind w:left="0" w:right="0" w:firstLine="0"/>
+              <w:jc w:val="left"/>
+              <w:rPr/>
+            </w:pPr>
+            <w:r>
+              <w:rPr>
+                <w:rtl w:val="0"/>
+              </w:rPr>
+              <w:t xml:space="preserve">10.9925</w:t>
+            </w:r>
+          </w:p>
+        </w:tc>
+        <w:tc>
+          <w:tcPr>
+            <w:shd w:fill="auto" w:val="clear"/>
+            <w:tcMar>
+              <w:top w:w="100.0" w:type="dxa"/>
+              <w:left w:w="100.0" w:type="dxa"/>
+              <w:bottom w:w="100.0" w:type="dxa"/>
+              <w:right w:w="100.0" w:type="dxa"/>
+            </w:tcMar>
+            <w:vAlign w:val="top"/>
+          </w:tcPr>
+          <w:p>
+            <w:pPr>
+              <w:keepNext w:val="0"/>
+              <w:keepLines w:val="0"/>
+              <w:pageBreakBefore w:val="0"/>
+              <w:widowControl w:val="0"/>
+              <w:pBdr>
+                <w:top w:space="0" w:sz="0" w:val="nil"/>
+                <w:left w:space="0" w:sz="0" w:val="nil"/>
+                <w:bottom w:space="0" w:sz="0" w:val="nil"/>
+                <w:right w:space="0" w:sz="0" w:val="nil"/>
+                <w:between w:space="0" w:sz="0" w:val="nil"/>
+              </w:pBdr>
+              <w:shd w:fill="auto" w:val="clear"/>
+              <w:spacing w:after="0" w:before="0" w:line="240" w:lineRule="auto"/>
+              <w:ind w:left="0" w:right="0" w:firstLine="0"/>
+              <w:jc w:val="left"/>
+              <w:rPr/>
+            </w:pPr>
+            <w:r>
+              <w:rPr>
+                <w:rtl w:val="0"/>
+              </w:rPr>
+              <w:t xml:space="preserve">12.0992</w:t>
+            </w:r>
+          </w:p>
+        </w:tc>
+      </w:tr>
+      <w:tr>
+        <w:trPr>
+          <w:cantSplit w:val="0"/>
+          <w:tblHeader w:val="0"/>
+        </w:trPr>
+        <w:tc>
+          <w:tcPr>
+            <w:shd w:fill="auto" w:val="clear"/>
+            <w:tcMar>
+              <w:top w:w="100.0" w:type="dxa"/>
+              <w:left w:w="100.0" w:type="dxa"/>
+              <w:bottom w:w="100.0" w:type="dxa"/>
+              <w:right w:w="100.0" w:type="dxa"/>
+            </w:tcMar>
+            <w:vAlign w:val="top"/>
+          </w:tcPr>
+          <w:p>
+            <w:pPr>
+              <w:keepNext w:val="0"/>
+              <w:keepLines w:val="0"/>
+              <w:pageBreakBefore w:val="0"/>
+              <w:widowControl w:val="0"/>
+              <w:pBdr>
+                <w:top w:space="0" w:sz="0" w:val="nil"/>
+                <w:left w:space="0" w:sz="0" w:val="nil"/>
+                <w:bottom w:space="0" w:sz="0" w:val="nil"/>
+                <w:right w:space="0" w:sz="0" w:val="nil"/>
+                <w:between w:space="0" w:sz="0" w:val="nil"/>
+              </w:pBdr>
+              <w:shd w:fill="auto" w:val="clear"/>
+              <w:spacing w:after="0" w:before="0" w:line="240" w:lineRule="auto"/>
+              <w:ind w:left="0" w:right="0" w:firstLine="0"/>
+              <w:jc w:val="left"/>
+              <w:rPr/>
+            </w:pPr>
+            <w:r>
+              <w:rPr>
+                <w:rtl w:val="0"/>
+              </w:rPr>
+              <w:t xml:space="preserve">Base linear model</w:t>
+            </w:r>
+          </w:p>
+        </w:tc>
+        <w:tc>
+          <w:tcPr>
+            <w:shd w:fill="auto" w:val="clear"/>
+            <w:tcMar>
+              <w:top w:w="100.0" w:type="dxa"/>
+              <w:left w:w="100.0" w:type="dxa"/>
+              <w:bottom w:w="100.0" w:type="dxa"/>
+              <w:right w:w="100.0" w:type="dxa"/>
+            </w:tcMar>
+            <w:vAlign w:val="top"/>
+          </w:tcPr>
+          <w:p>
+            <w:pPr>
+              <w:keepNext w:val="0"/>
+              <w:keepLines w:val="0"/>
+              <w:pageBreakBefore w:val="0"/>
+              <w:widowControl w:val="0"/>
+              <w:pBdr>
+                <w:top w:space="0" w:sz="0" w:val="nil"/>
+                <w:left w:space="0" w:sz="0" w:val="nil"/>
+                <w:bottom w:space="0" w:sz="0" w:val="nil"/>
+                <w:right w:space="0" w:sz="0" w:val="nil"/>
+                <w:between w:space="0" w:sz="0" w:val="nil"/>
+              </w:pBdr>
+              <w:shd w:fill="auto" w:val="clear"/>
+              <w:spacing w:after="0" w:before="0" w:line="240" w:lineRule="auto"/>
+              <w:ind w:left="0" w:right="0" w:firstLine="0"/>
+              <w:jc w:val="left"/>
+              <w:rPr/>
+            </w:pPr>
+            <w:r>
+              <w:rPr>
+                <w:rtl w:val="0"/>
+              </w:rPr>
+              <w:t xml:space="preserve">11.2246</w:t>
+            </w:r>
+          </w:p>
+        </w:tc>
+        <w:tc>
+          <w:tcPr>
+            <w:shd w:fill="auto" w:val="clear"/>
+            <w:tcMar>
+              <w:top w:w="100.0" w:type="dxa"/>
+              <w:left w:w="100.0" w:type="dxa"/>
+              <w:bottom w:w="100.0" w:type="dxa"/>
+              <w:right w:w="100.0" w:type="dxa"/>
+            </w:tcMar>
+            <w:vAlign w:val="top"/>
+          </w:tcPr>
+          <w:p>
+            <w:pPr>
+              <w:keepNext w:val="0"/>
+              <w:keepLines w:val="0"/>
+              <w:pageBreakBefore w:val="0"/>
+              <w:widowControl w:val="0"/>
+              <w:pBdr>
+                <w:top w:space="0" w:sz="0" w:val="nil"/>
+                <w:left w:space="0" w:sz="0" w:val="nil"/>
+                <w:bottom w:space="0" w:sz="0" w:val="nil"/>
+                <w:right w:space="0" w:sz="0" w:val="nil"/>
+                <w:between w:space="0" w:sz="0" w:val="nil"/>
+              </w:pBdr>
+              <w:shd w:fill="auto" w:val="clear"/>
+              <w:spacing w:after="0" w:before="0" w:line="240" w:lineRule="auto"/>
+              <w:ind w:left="0" w:right="0" w:firstLine="0"/>
+              <w:jc w:val="left"/>
+              <w:rPr/>
+            </w:pPr>
+            <w:r>
+              <w:rPr>
+                <w:rtl w:val="0"/>
+              </w:rPr>
+              <w:t xml:space="preserve">14.3503</w:t>
+            </w:r>
+          </w:p>
+        </w:tc>
+      </w:tr>
+      <w:tr>
+        <w:trPr>
+          <w:cantSplit w:val="0"/>
+          <w:tblHeader w:val="0"/>
+        </w:trPr>
+        <w:tc>
+          <w:tcPr>
+            <w:shd w:fill="auto" w:val="clear"/>
+            <w:tcMar>
+              <w:top w:w="100.0" w:type="dxa"/>
+              <w:left w:w="100.0" w:type="dxa"/>
+              <w:bottom w:w="100.0" w:type="dxa"/>
+              <w:right w:w="100.0" w:type="dxa"/>
+            </w:tcMar>
+            <w:vAlign w:val="top"/>
+          </w:tcPr>
+          <w:p>
+            <w:pPr>
+              <w:widowControl w:val="0"/>
+              <w:spacing w:line="240" w:lineRule="auto"/>
+              <w:rPr/>
+            </w:pPr>
+            <w:r>
+              <w:rPr>
+                <w:rtl w:val="0"/>
+              </w:rPr>
+              <w:t xml:space="preserve">Naive </w:t>
+            </w:r>
+          </w:p>
+        </w:tc>
+        <w:tc>
+          <w:tcPr>
+            <w:shd w:fill="auto" w:val="clear"/>
+            <w:tcMar>
+              <w:top w:w="100.0" w:type="dxa"/>
+              <w:left w:w="100.0" w:type="dxa"/>
+              <w:bottom w:w="100.0" w:type="dxa"/>
+              <w:right w:w="100.0" w:type="dxa"/>
+            </w:tcMar>
+            <w:vAlign w:val="top"/>
+          </w:tcPr>
+          <w:p>
+            <w:pPr>
+              <w:widowControl w:val="0"/>
+              <w:spacing w:line="240" w:lineRule="auto"/>
+              <w:rPr/>
+            </w:pPr>
+            <w:r>
+              <w:rPr>
+                <w:rtl w:val="0"/>
+              </w:rPr>
+              <w:t xml:space="preserve">11.8681</w:t>
+            </w:r>
+          </w:p>
+        </w:tc>
+        <w:tc>
+          <w:tcPr>
+            <w:shd w:fill="auto" w:val="clear"/>
+            <w:tcMar>
+              <w:top w:w="100.0" w:type="dxa"/>
+              <w:left w:w="100.0" w:type="dxa"/>
+              <w:bottom w:w="100.0" w:type="dxa"/>
+              <w:right w:w="100.0" w:type="dxa"/>
+            </w:tcMar>
+            <w:vAlign w:val="top"/>
+          </w:tcPr>
+          <w:p>
+            <w:pPr>
+              <w:widowControl w:val="0"/>
+              <w:spacing w:line="240" w:lineRule="auto"/>
+              <w:rPr/>
+            </w:pPr>
+            <w:r>
+              <w:rPr>
+                <w:rtl w:val="0"/>
+              </w:rPr>
+              <w:t xml:space="preserve">12.4360</w:t>
+            </w:r>
+          </w:p>
+        </w:tc>
+      </w:tr>
+    </w:tbl>
     <w:p>
       <w:pPr>
         <w:rPr>
@@ -909,7 +1997,7 @@
         <w:rPr>
           <w:rtl w:val="0"/>
         </w:rPr>
-        <w:t xml:space="preserve">XGBoost produced the best performance of the models tested, with a test MAE of 11.43. While the improvement over other models was small, it suggests that the model was able to capture some nonlinear relationships and interactions between variables that simpler linear models could not fully represent. In a sports setting, factors like team strength, recent form, and fatigue may interact in ways that are not perfectly linear, and boosting methods can account for those kinds of patterns.</w:t>
+        <w:t xml:space="preserve">XGBoost produced the best performance of the models tested, in both CV MAE and Test MAE - showing it was good across folds and for our use case. We felt that the greater complexity in explaining the model was worth it for the increased performance.</w:t>
       </w:r>
     </w:p>
     <w:p>
@@ -927,7 +2015,7 @@
         <w:rPr>
           <w:rtl w:val="0"/>
         </w:rPr>
-        <w:t xml:space="preserve">To find a good configuration, a hyperparameter sweep was performed to balance model flexibility with strong regularization. Because the dataset of historical games is not extremely large, the goal was to avoid overly complex trees that could overfit the training data.</w:t>
+        <w:t xml:space="preserve">To find a good configuration, a hyperparameter sweep was performed to balance model flexibility with strong regularization. Because the dataset of historical games that we thought were relevant is not extremely large, the goal was to avoid overly complex trees that could overfit the training data.</w:t>
       </w:r>
     </w:p>
     <w:p>
@@ -945,7 +2033,133 @@
         <w:rPr>
           <w:rtl w:val="0"/>
         </w:rPr>
-        <w:t xml:space="preserve">The final model used the following parameters:</w:t>
+        <w:t xml:space="preserve">Full Sweep - </w:t>
+      </w:r>
+    </w:p>
+    <w:p>
+      <w:pPr>
+        <w:pBdr>
+          <w:top w:color="auto" w:space="0" w:sz="0" w:val="none"/>
+          <w:bottom w:color="auto" w:space="0" w:sz="0" w:val="none"/>
+          <w:right w:color="auto" w:space="0" w:sz="0" w:val="none"/>
+          <w:between w:color="auto" w:space="0" w:sz="0" w:val="none"/>
+        </w:pBdr>
+        <w:spacing w:after="240" w:before="240" w:line="360" w:lineRule="auto"/>
+        <w:rPr/>
+      </w:pPr>
+      <w:r>
+        <w:rPr>
+          <w:rtl w:val="0"/>
+        </w:rPr>
+        <w:t xml:space="preserve">n_estimators: 120, 160, 220, 300</w:t>
+      </w:r>
+    </w:p>
+    <w:p>
+      <w:pPr>
+        <w:pBdr>
+          <w:top w:color="auto" w:space="0" w:sz="0" w:val="none"/>
+          <w:bottom w:color="auto" w:space="0" w:sz="0" w:val="none"/>
+          <w:right w:color="auto" w:space="0" w:sz="0" w:val="none"/>
+          <w:between w:color="auto" w:space="0" w:sz="0" w:val="none"/>
+        </w:pBdr>
+        <w:spacing w:after="240" w:before="240" w:line="360" w:lineRule="auto"/>
+        <w:rPr/>
+      </w:pPr>
+      <w:r>
+        <w:rPr>
+          <w:rtl w:val="0"/>
+        </w:rPr>
+        <w:t xml:space="preserve">learning_rate: 0.02, 0.03, 0.05</w:t>
+      </w:r>
+    </w:p>
+    <w:p>
+      <w:pPr>
+        <w:pBdr>
+          <w:top w:color="auto" w:space="0" w:sz="0" w:val="none"/>
+          <w:bottom w:color="auto" w:space="0" w:sz="0" w:val="none"/>
+          <w:right w:color="auto" w:space="0" w:sz="0" w:val="none"/>
+          <w:between w:color="auto" w:space="0" w:sz="0" w:val="none"/>
+        </w:pBdr>
+        <w:spacing w:after="240" w:before="240" w:line="360" w:lineRule="auto"/>
+        <w:rPr/>
+      </w:pPr>
+      <w:r>
+        <w:rPr>
+          <w:rtl w:val="0"/>
+        </w:rPr>
+        <w:t xml:space="preserve">max_depth: 2, 3</w:t>
+      </w:r>
+    </w:p>
+    <w:p>
+      <w:pPr>
+        <w:pBdr>
+          <w:top w:color="auto" w:space="0" w:sz="0" w:val="none"/>
+          <w:bottom w:color="auto" w:space="0" w:sz="0" w:val="none"/>
+          <w:right w:color="auto" w:space="0" w:sz="0" w:val="none"/>
+          <w:between w:color="auto" w:space="0" w:sz="0" w:val="none"/>
+        </w:pBdr>
+        <w:spacing w:after="240" w:before="240" w:line="360" w:lineRule="auto"/>
+        <w:rPr/>
+      </w:pPr>
+      <w:r>
+        <w:rPr>
+          <w:rtl w:val="0"/>
+        </w:rPr>
+        <w:t xml:space="preserve">min_child_weight: 15, 25, 40</w:t>
+      </w:r>
+    </w:p>
+    <w:p>
+      <w:pPr>
+        <w:pBdr>
+          <w:top w:color="auto" w:space="0" w:sz="0" w:val="none"/>
+          <w:bottom w:color="auto" w:space="0" w:sz="0" w:val="none"/>
+          <w:right w:color="auto" w:space="0" w:sz="0" w:val="none"/>
+          <w:between w:color="auto" w:space="0" w:sz="0" w:val="none"/>
+        </w:pBdr>
+        <w:spacing w:after="240" w:before="240" w:line="360" w:lineRule="auto"/>
+        <w:rPr/>
+      </w:pPr>
+      <w:r>
+        <w:rPr>
+          <w:rtl w:val="0"/>
+        </w:rPr>
+        <w:t xml:space="preserve">subsample: 0.55, 0.65, 0.80</w:t>
+      </w:r>
+    </w:p>
+    <w:p>
+      <w:pPr>
+        <w:pBdr>
+          <w:top w:color="auto" w:space="0" w:sz="0" w:val="none"/>
+          <w:bottom w:color="auto" w:space="0" w:sz="0" w:val="none"/>
+          <w:right w:color="auto" w:space="0" w:sz="0" w:val="none"/>
+          <w:between w:color="auto" w:space="0" w:sz="0" w:val="none"/>
+        </w:pBdr>
+        <w:spacing w:after="240" w:before="240" w:line="360" w:lineRule="auto"/>
+        <w:rPr/>
+      </w:pPr>
+      <w:r>
+        <w:rPr>
+          <w:rtl w:val="0"/>
+        </w:rPr>
+        <w:t xml:space="preserve">colsample_bytree: 0.55, 0.70, 0.85</w:t>
+      </w:r>
+    </w:p>
+    <w:p>
+      <w:pPr>
+        <w:pBdr>
+          <w:top w:color="auto" w:space="0" w:sz="0" w:val="none"/>
+          <w:bottom w:color="auto" w:space="0" w:sz="0" w:val="none"/>
+          <w:right w:color="auto" w:space="0" w:sz="0" w:val="none"/>
+          <w:between w:color="auto" w:space="0" w:sz="0" w:val="none"/>
+        </w:pBdr>
+        <w:spacing w:after="240" w:before="240" w:line="360" w:lineRule="auto"/>
+        <w:rPr/>
+      </w:pPr>
+      <w:r>
+        <w:rPr>
+          <w:rtl w:val="0"/>
+        </w:rPr>
+        <w:t xml:space="preserve">The final model used the following parameters/hyperparameters:</w:t>
       </w:r>
     </w:p>
     <w:p>
@@ -968,7 +2182,7 @@
         <w:rPr>
           <w:rtl w:val="0"/>
         </w:rPr>
-        <w:t xml:space="preserve">n_estimators = 160</w:t>
+        <w:t xml:space="preserve">n_estimators = 160 - sets the number of trees the model builds</w:t>
       </w:r>
     </w:p>
     <w:p>
@@ -991,7 +2205,7 @@
         <w:rPr>
           <w:rtl w:val="0"/>
         </w:rPr>
-        <w:t xml:space="preserve">learning_rate = 0.05</w:t>
+        <w:t xml:space="preserve">learning_rate = 0.03 - low learning rate trees do not quickly shift</w:t>
       </w:r>
     </w:p>
     <w:p>
@@ -1014,7 +2228,7 @@
         <w:rPr>
           <w:rtl w:val="0"/>
         </w:rPr>
-        <w:t xml:space="preserve">max_depth = 2</w:t>
+        <w:t xml:space="preserve">max_depth = 2 - each tree can only make two splits (reduce overfit)</w:t>
       </w:r>
     </w:p>
     <w:p>
@@ -1037,7 +2251,7 @@
         <w:rPr>
           <w:rtl w:val="0"/>
         </w:rPr>
-        <w:t xml:space="preserve">min_child_weight = 25</w:t>
+        <w:t xml:space="preserve">min_child_weight = 25 - min number of observations before a split</w:t>
       </w:r>
     </w:p>
     <w:p>
@@ -1060,7 +2274,7 @@
         <w:rPr>
           <w:rtl w:val="0"/>
         </w:rPr>
-        <w:t xml:space="preserve">subsample = 0.65</w:t>
+        <w:t xml:space="preserve">subsample = 0.55 - each tree trains on 55% of the training data</w:t>
       </w:r>
     </w:p>
     <w:p>
@@ -1083,7 +2297,7 @@
         <w:rPr>
           <w:rtl w:val="0"/>
         </w:rPr>
-        <w:t xml:space="preserve">colsample_bytree = 0.70</w:t>
+        <w:t xml:space="preserve">colsample_bytree = 0.55 - each tree only considers 55% of the features</w:t>
       </w:r>
     </w:p>
     <w:p>
@@ -1106,7 +2320,7 @@
         <w:rPr>
           <w:rtl w:val="0"/>
         </w:rPr>
-        <w:t xml:space="preserve">reg_lambda = 10</w:t>
+        <w:t xml:space="preserve">reg_lambda = 10 - L2 regularization value (fairly strong penalty - shrinks values)</w:t>
       </w:r>
     </w:p>
     <w:p>
@@ -1129,7 +2343,7 @@
         <w:rPr>
           <w:rtl w:val="0"/>
         </w:rPr>
-        <w:t xml:space="preserve">reg_alpha = 2</w:t>
+        <w:t xml:space="preserve">reg_alpha = 2 - L1 regularization (sets values to 0)</w:t>
       </w:r>
     </w:p>
     <w:p>
@@ -1152,7 +2366,7 @@
         <w:rPr>
           <w:rtl w:val="0"/>
         </w:rPr>
-        <w:t xml:space="preserve">gamma = 1</w:t>
+        <w:t xml:space="preserve">gamma = 1 - how much improvement is required for a split</w:t>
       </w:r>
     </w:p>
     <w:p>
@@ -1164,333 +2378,1698 @@
           <w:between w:color="auto" w:space="0" w:sz="0" w:val="none"/>
         </w:pBdr>
         <w:spacing w:after="240" w:before="240" w:line="360" w:lineRule="auto"/>
-        <w:ind w:left="0" w:firstLine="0"/>
         <w:rPr/>
       </w:pPr>
       <w:r>
         <w:rPr>
           <w:rtl w:val="0"/>
         </w:rPr>
-        <w:t xml:space="preserve">With these importance values:</w:t>
-      </w:r>
-    </w:p>
-    <w:p>
-      <w:pPr>
-        <w:numPr>
-          <w:ilvl w:val="0"/>
-          <w:numId w:val="3"/>
-        </w:numPr>
-        <w:pBdr>
-          <w:top w:color="auto" w:space="0" w:sz="0" w:val="none"/>
-          <w:bottom w:color="auto" w:space="0" w:sz="0" w:val="none"/>
-          <w:right w:color="auto" w:space="0" w:sz="0" w:val="none"/>
-          <w:between w:color="auto" w:space="0" w:sz="0" w:val="none"/>
-        </w:pBdr>
-        <w:spacing w:after="0" w:afterAutospacing="0" w:line="360" w:lineRule="auto"/>
-        <w:ind w:left="720" w:hanging="360"/>
-        <w:rPr>
-          <w:sz w:val="24"/>
-          <w:szCs w:val="24"/>
-        </w:rPr>
-      </w:pPr>
-      <w:r>
-        <w:rPr>
-          <w:rtl w:val="0"/>
-        </w:rPr>
-        <w:t xml:space="preserve">netrating_diff = 0.2717 (27.17% of the model’s total split gain came from splits using netrating_diff)</w:t>
-      </w:r>
-    </w:p>
-    <w:p>
-      <w:pPr>
-        <w:numPr>
-          <w:ilvl w:val="0"/>
-          <w:numId w:val="3"/>
-        </w:numPr>
-        <w:pBdr>
-          <w:top w:color="auto" w:space="0" w:sz="0" w:val="none"/>
-          <w:bottom w:color="auto" w:space="0" w:sz="0" w:val="none"/>
-          <w:right w:color="auto" w:space="0" w:sz="0" w:val="none"/>
-          <w:between w:color="auto" w:space="0" w:sz="0" w:val="none"/>
-        </w:pBdr>
-        <w:spacing w:after="0" w:afterAutospacing="0" w:line="360" w:lineRule="auto"/>
-        <w:ind w:left="720" w:hanging="360"/>
-        <w:rPr>
-          <w:sz w:val="24"/>
-          <w:szCs w:val="24"/>
-        </w:rPr>
-      </w:pPr>
-      <w:r>
-        <w:rPr>
-          <w:rtl w:val="0"/>
-        </w:rPr>
-        <w:t xml:space="preserve">split_margin_diff_calc = 0.1554</w:t>
-      </w:r>
-    </w:p>
-    <w:p>
-      <w:pPr>
-        <w:numPr>
-          <w:ilvl w:val="0"/>
-          <w:numId w:val="3"/>
-        </w:numPr>
-        <w:pBdr>
-          <w:top w:color="auto" w:space="0" w:sz="0" w:val="none"/>
-          <w:bottom w:color="auto" w:space="0" w:sz="0" w:val="none"/>
-          <w:right w:color="auto" w:space="0" w:sz="0" w:val="none"/>
-          <w:between w:color="auto" w:space="0" w:sz="0" w:val="none"/>
-        </w:pBdr>
-        <w:spacing w:after="0" w:afterAutospacing="0" w:line="360" w:lineRule="auto"/>
-        <w:ind w:left="720" w:hanging="360"/>
-        <w:rPr>
-          <w:sz w:val="24"/>
-          <w:szCs w:val="24"/>
-        </w:rPr>
-      </w:pPr>
-      <w:r>
-        <w:rPr>
-          <w:rtl w:val="0"/>
-        </w:rPr>
-        <w:t xml:space="preserve">winpct_diff_calc = 0.1545</w:t>
-      </w:r>
-    </w:p>
-    <w:p>
-      <w:pPr>
-        <w:numPr>
-          <w:ilvl w:val="0"/>
-          <w:numId w:val="3"/>
-        </w:numPr>
-        <w:pBdr>
-          <w:top w:color="auto" w:space="0" w:sz="0" w:val="none"/>
-          <w:bottom w:color="auto" w:space="0" w:sz="0" w:val="none"/>
-          <w:right w:color="auto" w:space="0" w:sz="0" w:val="none"/>
-          <w:between w:color="auto" w:space="0" w:sz="0" w:val="none"/>
-        </w:pBdr>
-        <w:spacing w:after="0" w:afterAutospacing="0" w:line="360" w:lineRule="auto"/>
-        <w:ind w:left="720" w:hanging="360"/>
-        <w:rPr>
-          <w:sz w:val="24"/>
-          <w:szCs w:val="24"/>
-        </w:rPr>
-      </w:pPr>
-      <w:r>
-        <w:rPr>
-          <w:rtl w:val="0"/>
-        </w:rPr>
-        <w:t xml:space="preserve">diff_last10_margin = 0.1043</w:t>
-      </w:r>
-    </w:p>
-    <w:p>
-      <w:pPr>
-        <w:numPr>
-          <w:ilvl w:val="0"/>
-          <w:numId w:val="3"/>
-        </w:numPr>
-        <w:pBdr>
-          <w:top w:color="auto" w:space="0" w:sz="0" w:val="none"/>
-          <w:bottom w:color="auto" w:space="0" w:sz="0" w:val="none"/>
-          <w:right w:color="auto" w:space="0" w:sz="0" w:val="none"/>
-          <w:between w:color="auto" w:space="0" w:sz="0" w:val="none"/>
-        </w:pBdr>
-        <w:spacing w:after="0" w:afterAutospacing="0" w:line="360" w:lineRule="auto"/>
-        <w:ind w:left="720" w:hanging="360"/>
-        <w:rPr>
-          <w:sz w:val="24"/>
-          <w:szCs w:val="24"/>
-        </w:rPr>
-      </w:pPr>
-      <w:r>
-        <w:rPr>
-          <w:rtl w:val="0"/>
-        </w:rPr>
-        <w:t xml:space="preserve">diff_roll20_ts = 0.0527</w:t>
-      </w:r>
-    </w:p>
-    <w:p>
-      <w:pPr>
-        <w:numPr>
-          <w:ilvl w:val="0"/>
-          <w:numId w:val="3"/>
-        </w:numPr>
-        <w:pBdr>
-          <w:top w:color="auto" w:space="0" w:sz="0" w:val="none"/>
-          <w:bottom w:color="auto" w:space="0" w:sz="0" w:val="none"/>
-          <w:right w:color="auto" w:space="0" w:sz="0" w:val="none"/>
-          <w:between w:color="auto" w:space="0" w:sz="0" w:val="none"/>
-        </w:pBdr>
-        <w:spacing w:after="0" w:afterAutospacing="0" w:line="360" w:lineRule="auto"/>
-        <w:ind w:left="720" w:hanging="360"/>
-        <w:rPr>
-          <w:sz w:val="24"/>
-          <w:szCs w:val="24"/>
-        </w:rPr>
-      </w:pPr>
-      <w:r>
-        <w:rPr>
-          <w:rtl w:val="0"/>
-        </w:rPr>
-        <w:t xml:space="preserve">h2h_margin_for_home = 0.0433</w:t>
-      </w:r>
-    </w:p>
-    <w:p>
-      <w:pPr>
-        <w:numPr>
-          <w:ilvl w:val="0"/>
-          <w:numId w:val="3"/>
-        </w:numPr>
-        <w:pBdr>
-          <w:top w:color="auto" w:space="0" w:sz="0" w:val="none"/>
-          <w:bottom w:color="auto" w:space="0" w:sz="0" w:val="none"/>
-          <w:right w:color="auto" w:space="0" w:sz="0" w:val="none"/>
-          <w:between w:color="auto" w:space="0" w:sz="0" w:val="none"/>
-        </w:pBdr>
-        <w:spacing w:after="0" w:afterAutospacing="0" w:line="360" w:lineRule="auto"/>
-        <w:ind w:left="720" w:hanging="360"/>
-        <w:rPr>
-          <w:sz w:val="24"/>
-          <w:szCs w:val="24"/>
-        </w:rPr>
-      </w:pPr>
-      <w:r>
-        <w:rPr>
-          <w:rtl w:val="0"/>
-        </w:rPr>
-        <w:t xml:space="preserve">diff_roll20_tov_rate = 0.0425</w:t>
-      </w:r>
-    </w:p>
-    <w:p>
-      <w:pPr>
-        <w:numPr>
-          <w:ilvl w:val="0"/>
-          <w:numId w:val="3"/>
-        </w:numPr>
-        <w:pBdr>
-          <w:top w:color="auto" w:space="0" w:sz="0" w:val="none"/>
-          <w:bottom w:color="auto" w:space="0" w:sz="0" w:val="none"/>
-          <w:right w:color="auto" w:space="0" w:sz="0" w:val="none"/>
-          <w:between w:color="auto" w:space="0" w:sz="0" w:val="none"/>
-        </w:pBdr>
-        <w:spacing w:after="0" w:afterAutospacing="0" w:line="360" w:lineRule="auto"/>
-        <w:ind w:left="720" w:hanging="360"/>
-        <w:rPr>
-          <w:sz w:val="24"/>
-          <w:szCs w:val="24"/>
-        </w:rPr>
-      </w:pPr>
-      <w:r>
-        <w:rPr>
-          <w:rtl w:val="0"/>
-        </w:rPr>
-        <w:t xml:space="preserve">home_rest_days_capped = 0.0412</w:t>
-      </w:r>
-    </w:p>
-    <w:p>
-      <w:pPr>
-        <w:numPr>
-          <w:ilvl w:val="0"/>
-          <w:numId w:val="3"/>
-        </w:numPr>
-        <w:pBdr>
-          <w:top w:color="auto" w:space="0" w:sz="0" w:val="none"/>
-          <w:bottom w:color="auto" w:space="0" w:sz="0" w:val="none"/>
-          <w:right w:color="auto" w:space="0" w:sz="0" w:val="none"/>
-          <w:between w:color="auto" w:space="0" w:sz="0" w:val="none"/>
-        </w:pBdr>
-        <w:spacing w:after="0" w:afterAutospacing="0" w:line="360" w:lineRule="auto"/>
-        <w:ind w:left="720" w:hanging="360"/>
-        <w:rPr>
-          <w:sz w:val="24"/>
-          <w:szCs w:val="24"/>
-        </w:rPr>
-      </w:pPr>
-      <w:r>
-        <w:rPr>
-          <w:rtl w:val="0"/>
-        </w:rPr>
-        <w:t xml:space="preserve">defRating_diff = 0.0411</w:t>
-      </w:r>
-    </w:p>
-    <w:p>
-      <w:pPr>
-        <w:numPr>
-          <w:ilvl w:val="0"/>
-          <w:numId w:val="3"/>
-        </w:numPr>
-        <w:pBdr>
-          <w:top w:color="auto" w:space="0" w:sz="0" w:val="none"/>
-          <w:bottom w:color="auto" w:space="0" w:sz="0" w:val="none"/>
-          <w:right w:color="auto" w:space="0" w:sz="0" w:val="none"/>
-          <w:between w:color="auto" w:space="0" w:sz="0" w:val="none"/>
-        </w:pBdr>
-        <w:spacing w:after="0" w:afterAutospacing="0" w:line="360" w:lineRule="auto"/>
-        <w:ind w:left="720" w:hanging="360"/>
-        <w:rPr>
-          <w:sz w:val="24"/>
-          <w:szCs w:val="24"/>
-        </w:rPr>
-      </w:pPr>
-      <w:r>
-        <w:rPr>
-          <w:rtl w:val="0"/>
-        </w:rPr>
-        <w:t xml:space="preserve">away_rest_days_capped = 0.0334</w:t>
-      </w:r>
-    </w:p>
-    <w:p>
-      <w:pPr>
-        <w:numPr>
-          <w:ilvl w:val="0"/>
-          <w:numId w:val="3"/>
-        </w:numPr>
-        <w:pBdr>
-          <w:top w:color="auto" w:space="0" w:sz="0" w:val="none"/>
-          <w:bottom w:color="auto" w:space="0" w:sz="0" w:val="none"/>
-          <w:right w:color="auto" w:space="0" w:sz="0" w:val="none"/>
-          <w:between w:color="auto" w:space="0" w:sz="0" w:val="none"/>
-        </w:pBdr>
-        <w:spacing w:after="0" w:afterAutospacing="0" w:line="360" w:lineRule="auto"/>
-        <w:ind w:left="720" w:hanging="360"/>
-        <w:rPr>
-          <w:sz w:val="24"/>
-          <w:szCs w:val="24"/>
-        </w:rPr>
-      </w:pPr>
-      <w:r>
-        <w:rPr>
-          <w:rtl w:val="0"/>
-        </w:rPr>
-        <w:t xml:space="preserve">Home_b2b = 0.0323</w:t>
-      </w:r>
-    </w:p>
-    <w:p>
-      <w:pPr>
-        <w:numPr>
-          <w:ilvl w:val="0"/>
-          <w:numId w:val="3"/>
-        </w:numPr>
-        <w:pBdr>
-          <w:top w:color="auto" w:space="0" w:sz="0" w:val="none"/>
-          <w:bottom w:color="auto" w:space="0" w:sz="0" w:val="none"/>
-          <w:right w:color="auto" w:space="0" w:sz="0" w:val="none"/>
-          <w:between w:color="auto" w:space="0" w:sz="0" w:val="none"/>
-        </w:pBdr>
-        <w:spacing w:after="340" w:line="360" w:lineRule="auto"/>
-        <w:ind w:left="720" w:hanging="360"/>
-        <w:rPr>
-          <w:sz w:val="24"/>
-          <w:szCs w:val="24"/>
-        </w:rPr>
-      </w:pPr>
-      <w:r>
-        <w:rPr>
-          <w:rtl w:val="0"/>
-        </w:rPr>
-        <w:t xml:space="preserve">diff_roll20_3pa_rate = 0.0277</w:t>
-      </w:r>
-      <w:r>
-        <w:rPr>
-          <w:rtl w:val="0"/>
-        </w:rPr>
-      </w:r>
-    </w:p>
+        <w:t xml:space="preserve">With these features and importance values (portion of the total-split improvement from each feature)</w:t>
+      </w:r>
+    </w:p>
+    <w:tbl>
+      <w:tblPr>
+        <w:tblStyle w:val="Table2"/>
+        <w:tblW w:w="9360.0" w:type="dxa"/>
+        <w:jc w:val="left"/>
+        <w:tblBorders>
+          <w:top w:color="000000" w:space="0" w:sz="8" w:val="single"/>
+          <w:left w:color="000000" w:space="0" w:sz="8" w:val="single"/>
+          <w:bottom w:color="000000" w:space="0" w:sz="8" w:val="single"/>
+          <w:right w:color="000000" w:space="0" w:sz="8" w:val="single"/>
+          <w:insideH w:color="000000" w:space="0" w:sz="8" w:val="single"/>
+          <w:insideV w:color="000000" w:space="0" w:sz="8" w:val="single"/>
+        </w:tblBorders>
+        <w:tblLayout w:type="fixed"/>
+        <w:tblLook w:val="0600"/>
+      </w:tblPr>
+      <w:tblGrid>
+        <w:gridCol w:w="3120"/>
+        <w:gridCol w:w="1380"/>
+        <w:gridCol w:w="4860"/>
+        <w:tblGridChange w:id="0">
+          <w:tblGrid>
+            <w:gridCol w:w="3120"/>
+            <w:gridCol w:w="1380"/>
+            <w:gridCol w:w="4860"/>
+          </w:tblGrid>
+        </w:tblGridChange>
+      </w:tblGrid>
+      <w:tr>
+        <w:trPr>
+          <w:cantSplit w:val="0"/>
+          <w:tblHeader w:val="0"/>
+        </w:trPr>
+        <w:tc>
+          <w:tcPr>
+            <w:shd w:fill="auto" w:val="clear"/>
+            <w:tcMar>
+              <w:top w:w="100.0" w:type="dxa"/>
+              <w:left w:w="100.0" w:type="dxa"/>
+              <w:bottom w:w="100.0" w:type="dxa"/>
+              <w:right w:w="100.0" w:type="dxa"/>
+            </w:tcMar>
+            <w:vAlign w:val="top"/>
+          </w:tcPr>
+          <w:p>
+            <w:pPr>
+              <w:keepNext w:val="0"/>
+              <w:keepLines w:val="0"/>
+              <w:pageBreakBefore w:val="0"/>
+              <w:widowControl w:val="0"/>
+              <w:pBdr>
+                <w:top w:space="0" w:sz="0" w:val="nil"/>
+                <w:left w:space="0" w:sz="0" w:val="nil"/>
+                <w:bottom w:space="0" w:sz="0" w:val="nil"/>
+                <w:right w:space="0" w:sz="0" w:val="nil"/>
+                <w:between w:space="0" w:sz="0" w:val="nil"/>
+              </w:pBdr>
+              <w:shd w:fill="auto" w:val="clear"/>
+              <w:spacing w:after="0" w:before="0" w:line="240" w:lineRule="auto"/>
+              <w:ind w:left="0" w:right="0" w:firstLine="0"/>
+              <w:jc w:val="left"/>
+              <w:rPr/>
+            </w:pPr>
+            <w:r>
+              <w:rPr>
+                <w:rtl w:val="0"/>
+              </w:rPr>
+              <w:t xml:space="preserve">Feature</w:t>
+            </w:r>
+          </w:p>
+        </w:tc>
+        <w:tc>
+          <w:tcPr>
+            <w:shd w:fill="auto" w:val="clear"/>
+            <w:tcMar>
+              <w:top w:w="100.0" w:type="dxa"/>
+              <w:left w:w="100.0" w:type="dxa"/>
+              <w:bottom w:w="100.0" w:type="dxa"/>
+              <w:right w:w="100.0" w:type="dxa"/>
+            </w:tcMar>
+            <w:vAlign w:val="top"/>
+          </w:tcPr>
+          <w:p>
+            <w:pPr>
+              <w:keepNext w:val="0"/>
+              <w:keepLines w:val="0"/>
+              <w:pageBreakBefore w:val="0"/>
+              <w:widowControl w:val="0"/>
+              <w:pBdr>
+                <w:top w:space="0" w:sz="0" w:val="nil"/>
+                <w:left w:space="0" w:sz="0" w:val="nil"/>
+                <w:bottom w:space="0" w:sz="0" w:val="nil"/>
+                <w:right w:space="0" w:sz="0" w:val="nil"/>
+                <w:between w:space="0" w:sz="0" w:val="nil"/>
+              </w:pBdr>
+              <w:shd w:fill="auto" w:val="clear"/>
+              <w:spacing w:after="0" w:before="0" w:line="240" w:lineRule="auto"/>
+              <w:ind w:left="0" w:right="0" w:firstLine="0"/>
+              <w:jc w:val="left"/>
+              <w:rPr/>
+            </w:pPr>
+            <w:r>
+              <w:rPr>
+                <w:rtl w:val="0"/>
+              </w:rPr>
+              <w:t xml:space="preserve">Importance</w:t>
+            </w:r>
+          </w:p>
+        </w:tc>
+        <w:tc>
+          <w:tcPr>
+            <w:shd w:fill="auto" w:val="clear"/>
+            <w:tcMar>
+              <w:top w:w="100.0" w:type="dxa"/>
+              <w:left w:w="100.0" w:type="dxa"/>
+              <w:bottom w:w="100.0" w:type="dxa"/>
+              <w:right w:w="100.0" w:type="dxa"/>
+            </w:tcMar>
+            <w:vAlign w:val="top"/>
+          </w:tcPr>
+          <w:p>
+            <w:pPr>
+              <w:keepNext w:val="0"/>
+              <w:keepLines w:val="0"/>
+              <w:pageBreakBefore w:val="0"/>
+              <w:widowControl w:val="0"/>
+              <w:pBdr>
+                <w:top w:space="0" w:sz="0" w:val="nil"/>
+                <w:left w:space="0" w:sz="0" w:val="nil"/>
+                <w:bottom w:space="0" w:sz="0" w:val="nil"/>
+                <w:right w:space="0" w:sz="0" w:val="nil"/>
+                <w:between w:space="0" w:sz="0" w:val="nil"/>
+              </w:pBdr>
+              <w:shd w:fill="auto" w:val="clear"/>
+              <w:spacing w:after="0" w:before="0" w:line="240" w:lineRule="auto"/>
+              <w:ind w:left="0" w:right="0" w:firstLine="0"/>
+              <w:jc w:val="left"/>
+              <w:rPr/>
+            </w:pPr>
+            <w:r>
+              <w:rPr>
+                <w:rtl w:val="0"/>
+              </w:rPr>
+              <w:t xml:space="preserve">Description</w:t>
+            </w:r>
+          </w:p>
+        </w:tc>
+      </w:tr>
+      <w:tr>
+        <w:trPr>
+          <w:cantSplit w:val="0"/>
+          <w:tblHeader w:val="0"/>
+        </w:trPr>
+        <w:tc>
+          <w:tcPr>
+            <w:shd w:fill="auto" w:val="clear"/>
+            <w:tcMar>
+              <w:top w:w="100.0" w:type="dxa"/>
+              <w:left w:w="100.0" w:type="dxa"/>
+              <w:bottom w:w="100.0" w:type="dxa"/>
+              <w:right w:w="100.0" w:type="dxa"/>
+            </w:tcMar>
+            <w:vAlign w:val="top"/>
+          </w:tcPr>
+          <w:p>
+            <w:pPr>
+              <w:keepNext w:val="0"/>
+              <w:keepLines w:val="0"/>
+              <w:pageBreakBefore w:val="0"/>
+              <w:widowControl w:val="0"/>
+              <w:pBdr>
+                <w:top w:space="0" w:sz="0" w:val="nil"/>
+                <w:left w:space="0" w:sz="0" w:val="nil"/>
+                <w:bottom w:space="0" w:sz="0" w:val="nil"/>
+                <w:right w:space="0" w:sz="0" w:val="nil"/>
+                <w:between w:space="0" w:sz="0" w:val="nil"/>
+              </w:pBdr>
+              <w:shd w:fill="auto" w:val="clear"/>
+              <w:spacing w:after="0" w:before="0" w:line="240" w:lineRule="auto"/>
+              <w:ind w:left="0" w:right="0" w:firstLine="0"/>
+              <w:jc w:val="left"/>
+              <w:rPr/>
+            </w:pPr>
+            <w:r>
+              <w:rPr>
+                <w:rtl w:val="0"/>
+              </w:rPr>
+              <w:t xml:space="preserve">netrating_diff</w:t>
+            </w:r>
+          </w:p>
+        </w:tc>
+        <w:tc>
+          <w:tcPr>
+            <w:shd w:fill="auto" w:val="clear"/>
+            <w:tcMar>
+              <w:top w:w="100.0" w:type="dxa"/>
+              <w:left w:w="100.0" w:type="dxa"/>
+              <w:bottom w:w="100.0" w:type="dxa"/>
+              <w:right w:w="100.0" w:type="dxa"/>
+            </w:tcMar>
+            <w:vAlign w:val="top"/>
+          </w:tcPr>
+          <w:p>
+            <w:pPr>
+              <w:keepNext w:val="0"/>
+              <w:keepLines w:val="0"/>
+              <w:pageBreakBefore w:val="0"/>
+              <w:widowControl w:val="0"/>
+              <w:pBdr>
+                <w:top w:space="0" w:sz="0" w:val="nil"/>
+                <w:left w:space="0" w:sz="0" w:val="nil"/>
+                <w:bottom w:space="0" w:sz="0" w:val="nil"/>
+                <w:right w:space="0" w:sz="0" w:val="nil"/>
+                <w:between w:space="0" w:sz="0" w:val="nil"/>
+              </w:pBdr>
+              <w:shd w:fill="auto" w:val="clear"/>
+              <w:spacing w:after="0" w:before="0" w:line="240" w:lineRule="auto"/>
+              <w:ind w:left="0" w:right="0" w:firstLine="0"/>
+              <w:jc w:val="left"/>
+              <w:rPr/>
+            </w:pPr>
+            <w:r>
+              <w:rPr>
+                <w:rtl w:val="0"/>
+              </w:rPr>
+              <w:t xml:space="preserve">0.3061</w:t>
+            </w:r>
+          </w:p>
+        </w:tc>
+        <w:tc>
+          <w:tcPr>
+            <w:shd w:fill="auto" w:val="clear"/>
+            <w:tcMar>
+              <w:top w:w="100.0" w:type="dxa"/>
+              <w:left w:w="100.0" w:type="dxa"/>
+              <w:bottom w:w="100.0" w:type="dxa"/>
+              <w:right w:w="100.0" w:type="dxa"/>
+            </w:tcMar>
+            <w:vAlign w:val="top"/>
+          </w:tcPr>
+          <w:p>
+            <w:pPr>
+              <w:keepNext w:val="0"/>
+              <w:keepLines w:val="0"/>
+              <w:pageBreakBefore w:val="0"/>
+              <w:widowControl w:val="0"/>
+              <w:pBdr>
+                <w:top w:space="0" w:sz="0" w:val="nil"/>
+                <w:left w:space="0" w:sz="0" w:val="nil"/>
+                <w:bottom w:space="0" w:sz="0" w:val="nil"/>
+                <w:right w:space="0" w:sz="0" w:val="nil"/>
+                <w:between w:space="0" w:sz="0" w:val="nil"/>
+              </w:pBdr>
+              <w:shd w:fill="auto" w:val="clear"/>
+              <w:spacing w:after="0" w:before="0" w:line="240" w:lineRule="auto"/>
+              <w:ind w:left="0" w:right="0" w:firstLine="0"/>
+              <w:jc w:val="left"/>
+              <w:rPr/>
+            </w:pPr>
+            <w:r>
+              <w:rPr>
+                <w:rtl w:val="0"/>
+              </w:rPr>
+              <w:t xml:space="preserve">Difference in net rating before the game</w:t>
+            </w:r>
+          </w:p>
+        </w:tc>
+      </w:tr>
+      <w:tr>
+        <w:trPr>
+          <w:cantSplit w:val="0"/>
+          <w:tblHeader w:val="0"/>
+        </w:trPr>
+        <w:tc>
+          <w:tcPr>
+            <w:shd w:fill="auto" w:val="clear"/>
+            <w:tcMar>
+              <w:top w:w="100.0" w:type="dxa"/>
+              <w:left w:w="100.0" w:type="dxa"/>
+              <w:bottom w:w="100.0" w:type="dxa"/>
+              <w:right w:w="100.0" w:type="dxa"/>
+            </w:tcMar>
+            <w:vAlign w:val="top"/>
+          </w:tcPr>
+          <w:p>
+            <w:pPr>
+              <w:keepNext w:val="0"/>
+              <w:keepLines w:val="0"/>
+              <w:pageBreakBefore w:val="0"/>
+              <w:widowControl w:val="0"/>
+              <w:pBdr>
+                <w:top w:space="0" w:sz="0" w:val="nil"/>
+                <w:left w:space="0" w:sz="0" w:val="nil"/>
+                <w:bottom w:space="0" w:sz="0" w:val="nil"/>
+                <w:right w:space="0" w:sz="0" w:val="nil"/>
+                <w:between w:space="0" w:sz="0" w:val="nil"/>
+              </w:pBdr>
+              <w:shd w:fill="auto" w:val="clear"/>
+              <w:spacing w:after="0" w:before="0" w:line="240" w:lineRule="auto"/>
+              <w:ind w:left="0" w:right="0" w:firstLine="0"/>
+              <w:jc w:val="left"/>
+              <w:rPr/>
+            </w:pPr>
+            <w:r>
+              <w:rPr>
+                <w:rtl w:val="0"/>
+              </w:rPr>
+              <w:t xml:space="preserve">winpct_diff_calc</w:t>
+            </w:r>
+          </w:p>
+        </w:tc>
+        <w:tc>
+          <w:tcPr>
+            <w:shd w:fill="auto" w:val="clear"/>
+            <w:tcMar>
+              <w:top w:w="100.0" w:type="dxa"/>
+              <w:left w:w="100.0" w:type="dxa"/>
+              <w:bottom w:w="100.0" w:type="dxa"/>
+              <w:right w:w="100.0" w:type="dxa"/>
+            </w:tcMar>
+            <w:vAlign w:val="top"/>
+          </w:tcPr>
+          <w:p>
+            <w:pPr>
+              <w:keepNext w:val="0"/>
+              <w:keepLines w:val="0"/>
+              <w:pageBreakBefore w:val="0"/>
+              <w:widowControl w:val="0"/>
+              <w:pBdr>
+                <w:top w:space="0" w:sz="0" w:val="nil"/>
+                <w:left w:space="0" w:sz="0" w:val="nil"/>
+                <w:bottom w:space="0" w:sz="0" w:val="nil"/>
+                <w:right w:space="0" w:sz="0" w:val="nil"/>
+                <w:between w:space="0" w:sz="0" w:val="nil"/>
+              </w:pBdr>
+              <w:shd w:fill="auto" w:val="clear"/>
+              <w:spacing w:after="0" w:before="0" w:line="240" w:lineRule="auto"/>
+              <w:ind w:left="0" w:right="0" w:firstLine="0"/>
+              <w:jc w:val="left"/>
+              <w:rPr/>
+            </w:pPr>
+            <w:r>
+              <w:rPr>
+                <w:rtl w:val="0"/>
+              </w:rPr>
+              <w:t xml:space="preserve">0.1626</w:t>
+            </w:r>
+          </w:p>
+        </w:tc>
+        <w:tc>
+          <w:tcPr>
+            <w:shd w:fill="auto" w:val="clear"/>
+            <w:tcMar>
+              <w:top w:w="100.0" w:type="dxa"/>
+              <w:left w:w="100.0" w:type="dxa"/>
+              <w:bottom w:w="100.0" w:type="dxa"/>
+              <w:right w:w="100.0" w:type="dxa"/>
+            </w:tcMar>
+            <w:vAlign w:val="top"/>
+          </w:tcPr>
+          <w:p>
+            <w:pPr>
+              <w:keepNext w:val="0"/>
+              <w:keepLines w:val="0"/>
+              <w:pageBreakBefore w:val="0"/>
+              <w:widowControl w:val="0"/>
+              <w:pBdr>
+                <w:top w:space="0" w:sz="0" w:val="nil"/>
+                <w:left w:space="0" w:sz="0" w:val="nil"/>
+                <w:bottom w:space="0" w:sz="0" w:val="nil"/>
+                <w:right w:space="0" w:sz="0" w:val="nil"/>
+                <w:between w:space="0" w:sz="0" w:val="nil"/>
+              </w:pBdr>
+              <w:shd w:fill="auto" w:val="clear"/>
+              <w:spacing w:after="0" w:before="0" w:line="240" w:lineRule="auto"/>
+              <w:ind w:left="0" w:right="0" w:firstLine="0"/>
+              <w:jc w:val="left"/>
+              <w:rPr/>
+            </w:pPr>
+            <w:r>
+              <w:rPr>
+                <w:rtl w:val="0"/>
+              </w:rPr>
+              <w:t xml:space="preserve">Difference in current season win percentage</w:t>
+            </w:r>
+          </w:p>
+        </w:tc>
+      </w:tr>
+      <w:tr>
+        <w:trPr>
+          <w:cantSplit w:val="0"/>
+          <w:tblHeader w:val="0"/>
+        </w:trPr>
+        <w:tc>
+          <w:tcPr>
+            <w:shd w:fill="auto" w:val="clear"/>
+            <w:tcMar>
+              <w:top w:w="100.0" w:type="dxa"/>
+              <w:left w:w="100.0" w:type="dxa"/>
+              <w:bottom w:w="100.0" w:type="dxa"/>
+              <w:right w:w="100.0" w:type="dxa"/>
+            </w:tcMar>
+            <w:vAlign w:val="top"/>
+          </w:tcPr>
+          <w:p>
+            <w:pPr>
+              <w:keepNext w:val="0"/>
+              <w:keepLines w:val="0"/>
+              <w:pageBreakBefore w:val="0"/>
+              <w:widowControl w:val="0"/>
+              <w:pBdr>
+                <w:top w:space="0" w:sz="0" w:val="nil"/>
+                <w:left w:space="0" w:sz="0" w:val="nil"/>
+                <w:bottom w:space="0" w:sz="0" w:val="nil"/>
+                <w:right w:space="0" w:sz="0" w:val="nil"/>
+                <w:between w:space="0" w:sz="0" w:val="nil"/>
+              </w:pBdr>
+              <w:shd w:fill="auto" w:val="clear"/>
+              <w:spacing w:after="0" w:before="0" w:line="240" w:lineRule="auto"/>
+              <w:ind w:left="0" w:right="0" w:firstLine="0"/>
+              <w:jc w:val="left"/>
+              <w:rPr/>
+            </w:pPr>
+            <w:r>
+              <w:rPr>
+                <w:rtl w:val="0"/>
+              </w:rPr>
+              <w:t xml:space="preserve">split_margin_diff_calc</w:t>
+            </w:r>
+          </w:p>
+        </w:tc>
+        <w:tc>
+          <w:tcPr>
+            <w:shd w:fill="auto" w:val="clear"/>
+            <w:tcMar>
+              <w:top w:w="100.0" w:type="dxa"/>
+              <w:left w:w="100.0" w:type="dxa"/>
+              <w:bottom w:w="100.0" w:type="dxa"/>
+              <w:right w:w="100.0" w:type="dxa"/>
+            </w:tcMar>
+            <w:vAlign w:val="top"/>
+          </w:tcPr>
+          <w:p>
+            <w:pPr>
+              <w:keepNext w:val="0"/>
+              <w:keepLines w:val="0"/>
+              <w:pageBreakBefore w:val="0"/>
+              <w:widowControl w:val="0"/>
+              <w:pBdr>
+                <w:top w:space="0" w:sz="0" w:val="nil"/>
+                <w:left w:space="0" w:sz="0" w:val="nil"/>
+                <w:bottom w:space="0" w:sz="0" w:val="nil"/>
+                <w:right w:space="0" w:sz="0" w:val="nil"/>
+                <w:between w:space="0" w:sz="0" w:val="nil"/>
+              </w:pBdr>
+              <w:shd w:fill="auto" w:val="clear"/>
+              <w:spacing w:after="0" w:before="0" w:line="240" w:lineRule="auto"/>
+              <w:ind w:left="0" w:right="0" w:firstLine="0"/>
+              <w:jc w:val="left"/>
+              <w:rPr/>
+            </w:pPr>
+            <w:r>
+              <w:rPr>
+                <w:rtl w:val="0"/>
+              </w:rPr>
+              <w:t xml:space="preserve">0.1500</w:t>
+            </w:r>
+          </w:p>
+        </w:tc>
+        <w:tc>
+          <w:tcPr>
+            <w:shd w:fill="auto" w:val="clear"/>
+            <w:tcMar>
+              <w:top w:w="100.0" w:type="dxa"/>
+              <w:left w:w="100.0" w:type="dxa"/>
+              <w:bottom w:w="100.0" w:type="dxa"/>
+              <w:right w:w="100.0" w:type="dxa"/>
+            </w:tcMar>
+            <w:vAlign w:val="top"/>
+          </w:tcPr>
+          <w:p>
+            <w:pPr>
+              <w:keepNext w:val="0"/>
+              <w:keepLines w:val="0"/>
+              <w:pageBreakBefore w:val="0"/>
+              <w:widowControl w:val="0"/>
+              <w:pBdr>
+                <w:top w:space="0" w:sz="0" w:val="nil"/>
+                <w:left w:space="0" w:sz="0" w:val="nil"/>
+                <w:bottom w:space="0" w:sz="0" w:val="nil"/>
+                <w:right w:space="0" w:sz="0" w:val="nil"/>
+                <w:between w:space="0" w:sz="0" w:val="nil"/>
+              </w:pBdr>
+              <w:shd w:fill="auto" w:val="clear"/>
+              <w:spacing w:after="0" w:before="0" w:line="240" w:lineRule="auto"/>
+              <w:ind w:left="0" w:right="0" w:firstLine="0"/>
+              <w:jc w:val="left"/>
+              <w:rPr/>
+            </w:pPr>
+            <w:r>
+              <w:rPr>
+                <w:rtl w:val="0"/>
+              </w:rPr>
+              <w:t xml:space="preserve">Uses home and away splits to capture team habits</w:t>
+            </w:r>
+          </w:p>
+        </w:tc>
+      </w:tr>
+      <w:tr>
+        <w:trPr>
+          <w:cantSplit w:val="0"/>
+          <w:tblHeader w:val="0"/>
+        </w:trPr>
+        <w:tc>
+          <w:tcPr>
+            <w:shd w:fill="auto" w:val="clear"/>
+            <w:tcMar>
+              <w:top w:w="100.0" w:type="dxa"/>
+              <w:left w:w="100.0" w:type="dxa"/>
+              <w:bottom w:w="100.0" w:type="dxa"/>
+              <w:right w:w="100.0" w:type="dxa"/>
+            </w:tcMar>
+            <w:vAlign w:val="top"/>
+          </w:tcPr>
+          <w:p>
+            <w:pPr>
+              <w:keepNext w:val="0"/>
+              <w:keepLines w:val="0"/>
+              <w:pageBreakBefore w:val="0"/>
+              <w:widowControl w:val="0"/>
+              <w:pBdr>
+                <w:top w:space="0" w:sz="0" w:val="nil"/>
+                <w:left w:space="0" w:sz="0" w:val="nil"/>
+                <w:bottom w:space="0" w:sz="0" w:val="nil"/>
+                <w:right w:space="0" w:sz="0" w:val="nil"/>
+                <w:between w:space="0" w:sz="0" w:val="nil"/>
+              </w:pBdr>
+              <w:shd w:fill="auto" w:val="clear"/>
+              <w:spacing w:after="0" w:before="0" w:line="240" w:lineRule="auto"/>
+              <w:ind w:left="0" w:right="0" w:firstLine="0"/>
+              <w:jc w:val="left"/>
+              <w:rPr/>
+            </w:pPr>
+            <w:r>
+              <w:rPr>
+                <w:rtl w:val="0"/>
+              </w:rPr>
+              <w:t xml:space="preserve">diff_last10_margin</w:t>
+            </w:r>
+          </w:p>
+        </w:tc>
+        <w:tc>
+          <w:tcPr>
+            <w:shd w:fill="auto" w:val="clear"/>
+            <w:tcMar>
+              <w:top w:w="100.0" w:type="dxa"/>
+              <w:left w:w="100.0" w:type="dxa"/>
+              <w:bottom w:w="100.0" w:type="dxa"/>
+              <w:right w:w="100.0" w:type="dxa"/>
+            </w:tcMar>
+            <w:vAlign w:val="top"/>
+          </w:tcPr>
+          <w:p>
+            <w:pPr>
+              <w:keepNext w:val="0"/>
+              <w:keepLines w:val="0"/>
+              <w:pageBreakBefore w:val="0"/>
+              <w:widowControl w:val="0"/>
+              <w:pBdr>
+                <w:top w:space="0" w:sz="0" w:val="nil"/>
+                <w:left w:space="0" w:sz="0" w:val="nil"/>
+                <w:bottom w:space="0" w:sz="0" w:val="nil"/>
+                <w:right w:space="0" w:sz="0" w:val="nil"/>
+                <w:between w:space="0" w:sz="0" w:val="nil"/>
+              </w:pBdr>
+              <w:shd w:fill="auto" w:val="clear"/>
+              <w:spacing w:after="0" w:before="0" w:line="240" w:lineRule="auto"/>
+              <w:ind w:left="0" w:right="0" w:firstLine="0"/>
+              <w:jc w:val="left"/>
+              <w:rPr/>
+            </w:pPr>
+            <w:r>
+              <w:rPr>
+                <w:rtl w:val="0"/>
+              </w:rPr>
+              <w:t xml:space="preserve">0.0932</w:t>
+            </w:r>
+          </w:p>
+        </w:tc>
+        <w:tc>
+          <w:tcPr>
+            <w:shd w:fill="auto" w:val="clear"/>
+            <w:tcMar>
+              <w:top w:w="100.0" w:type="dxa"/>
+              <w:left w:w="100.0" w:type="dxa"/>
+              <w:bottom w:w="100.0" w:type="dxa"/>
+              <w:right w:w="100.0" w:type="dxa"/>
+            </w:tcMar>
+            <w:vAlign w:val="top"/>
+          </w:tcPr>
+          <w:p>
+            <w:pPr>
+              <w:keepNext w:val="0"/>
+              <w:keepLines w:val="0"/>
+              <w:pageBreakBefore w:val="0"/>
+              <w:widowControl w:val="0"/>
+              <w:pBdr>
+                <w:top w:space="0" w:sz="0" w:val="nil"/>
+                <w:left w:space="0" w:sz="0" w:val="nil"/>
+                <w:bottom w:space="0" w:sz="0" w:val="nil"/>
+                <w:right w:space="0" w:sz="0" w:val="nil"/>
+                <w:between w:space="0" w:sz="0" w:val="nil"/>
+              </w:pBdr>
+              <w:shd w:fill="auto" w:val="clear"/>
+              <w:spacing w:after="0" w:before="0" w:line="240" w:lineRule="auto"/>
+              <w:ind w:left="0" w:right="0" w:firstLine="0"/>
+              <w:jc w:val="left"/>
+              <w:rPr/>
+            </w:pPr>
+            <w:r>
+              <w:rPr>
+                <w:rtl w:val="0"/>
+              </w:rPr>
+              <w:t xml:space="preserve">Last 10 margins to capture team form</w:t>
+            </w:r>
+          </w:p>
+        </w:tc>
+      </w:tr>
+      <w:tr>
+        <w:trPr>
+          <w:cantSplit w:val="0"/>
+          <w:tblHeader w:val="0"/>
+        </w:trPr>
+        <w:tc>
+          <w:tcPr>
+            <w:shd w:fill="auto" w:val="clear"/>
+            <w:tcMar>
+              <w:top w:w="100.0" w:type="dxa"/>
+              <w:left w:w="100.0" w:type="dxa"/>
+              <w:bottom w:w="100.0" w:type="dxa"/>
+              <w:right w:w="100.0" w:type="dxa"/>
+            </w:tcMar>
+            <w:vAlign w:val="top"/>
+          </w:tcPr>
+          <w:p>
+            <w:pPr>
+              <w:keepNext w:val="0"/>
+              <w:keepLines w:val="0"/>
+              <w:pageBreakBefore w:val="0"/>
+              <w:widowControl w:val="0"/>
+              <w:pBdr>
+                <w:top w:space="0" w:sz="0" w:val="nil"/>
+                <w:left w:space="0" w:sz="0" w:val="nil"/>
+                <w:bottom w:space="0" w:sz="0" w:val="nil"/>
+                <w:right w:space="0" w:sz="0" w:val="nil"/>
+                <w:between w:space="0" w:sz="0" w:val="nil"/>
+              </w:pBdr>
+              <w:shd w:fill="auto" w:val="clear"/>
+              <w:spacing w:after="0" w:before="0" w:line="240" w:lineRule="auto"/>
+              <w:ind w:left="0" w:right="0" w:firstLine="0"/>
+              <w:jc w:val="left"/>
+              <w:rPr/>
+            </w:pPr>
+            <w:r>
+              <w:rPr>
+                <w:rtl w:val="0"/>
+              </w:rPr>
+              <w:t xml:space="preserve">defRating_diff</w:t>
+            </w:r>
+          </w:p>
+        </w:tc>
+        <w:tc>
+          <w:tcPr>
+            <w:shd w:fill="auto" w:val="clear"/>
+            <w:tcMar>
+              <w:top w:w="100.0" w:type="dxa"/>
+              <w:left w:w="100.0" w:type="dxa"/>
+              <w:bottom w:w="100.0" w:type="dxa"/>
+              <w:right w:w="100.0" w:type="dxa"/>
+            </w:tcMar>
+            <w:vAlign w:val="top"/>
+          </w:tcPr>
+          <w:p>
+            <w:pPr>
+              <w:keepNext w:val="0"/>
+              <w:keepLines w:val="0"/>
+              <w:pageBreakBefore w:val="0"/>
+              <w:widowControl w:val="0"/>
+              <w:pBdr>
+                <w:top w:space="0" w:sz="0" w:val="nil"/>
+                <w:left w:space="0" w:sz="0" w:val="nil"/>
+                <w:bottom w:space="0" w:sz="0" w:val="nil"/>
+                <w:right w:space="0" w:sz="0" w:val="nil"/>
+                <w:between w:space="0" w:sz="0" w:val="nil"/>
+              </w:pBdr>
+              <w:shd w:fill="auto" w:val="clear"/>
+              <w:spacing w:after="0" w:before="0" w:line="240" w:lineRule="auto"/>
+              <w:ind w:left="0" w:right="0" w:firstLine="0"/>
+              <w:jc w:val="left"/>
+              <w:rPr/>
+            </w:pPr>
+            <w:r>
+              <w:rPr>
+                <w:rtl w:val="0"/>
+              </w:rPr>
+              <w:t xml:space="preserve">0.0560</w:t>
+            </w:r>
+          </w:p>
+        </w:tc>
+        <w:tc>
+          <w:tcPr>
+            <w:shd w:fill="auto" w:val="clear"/>
+            <w:tcMar>
+              <w:top w:w="100.0" w:type="dxa"/>
+              <w:left w:w="100.0" w:type="dxa"/>
+              <w:bottom w:w="100.0" w:type="dxa"/>
+              <w:right w:w="100.0" w:type="dxa"/>
+            </w:tcMar>
+            <w:vAlign w:val="top"/>
+          </w:tcPr>
+          <w:p>
+            <w:pPr>
+              <w:keepNext w:val="0"/>
+              <w:keepLines w:val="0"/>
+              <w:pageBreakBefore w:val="0"/>
+              <w:widowControl w:val="0"/>
+              <w:pBdr>
+                <w:top w:space="0" w:sz="0" w:val="nil"/>
+                <w:left w:space="0" w:sz="0" w:val="nil"/>
+                <w:bottom w:space="0" w:sz="0" w:val="nil"/>
+                <w:right w:space="0" w:sz="0" w:val="nil"/>
+                <w:between w:space="0" w:sz="0" w:val="nil"/>
+              </w:pBdr>
+              <w:shd w:fill="auto" w:val="clear"/>
+              <w:spacing w:after="0" w:before="0" w:line="240" w:lineRule="auto"/>
+              <w:ind w:left="0" w:right="0" w:firstLine="0"/>
+              <w:jc w:val="left"/>
+              <w:rPr/>
+            </w:pPr>
+            <w:r>
+              <w:rPr>
+                <w:rtl w:val="0"/>
+              </w:rPr>
+              <w:t xml:space="preserve">Difference in the def rating before the game</w:t>
+            </w:r>
+          </w:p>
+        </w:tc>
+      </w:tr>
+      <w:tr>
+        <w:trPr>
+          <w:cantSplit w:val="0"/>
+          <w:tblHeader w:val="0"/>
+        </w:trPr>
+        <w:tc>
+          <w:tcPr>
+            <w:shd w:fill="auto" w:val="clear"/>
+            <w:tcMar>
+              <w:top w:w="100.0" w:type="dxa"/>
+              <w:left w:w="100.0" w:type="dxa"/>
+              <w:bottom w:w="100.0" w:type="dxa"/>
+              <w:right w:w="100.0" w:type="dxa"/>
+            </w:tcMar>
+            <w:vAlign w:val="top"/>
+          </w:tcPr>
+          <w:p>
+            <w:pPr>
+              <w:keepNext w:val="0"/>
+              <w:keepLines w:val="0"/>
+              <w:pageBreakBefore w:val="0"/>
+              <w:widowControl w:val="0"/>
+              <w:pBdr>
+                <w:top w:space="0" w:sz="0" w:val="nil"/>
+                <w:left w:space="0" w:sz="0" w:val="nil"/>
+                <w:bottom w:space="0" w:sz="0" w:val="nil"/>
+                <w:right w:space="0" w:sz="0" w:val="nil"/>
+                <w:between w:space="0" w:sz="0" w:val="nil"/>
+              </w:pBdr>
+              <w:shd w:fill="auto" w:val="clear"/>
+              <w:spacing w:after="0" w:before="0" w:line="240" w:lineRule="auto"/>
+              <w:ind w:left="0" w:right="0" w:firstLine="0"/>
+              <w:jc w:val="left"/>
+              <w:rPr/>
+            </w:pPr>
+            <w:r>
+              <w:rPr>
+                <w:rtl w:val="0"/>
+              </w:rPr>
+              <w:t xml:space="preserve">diff_roll20_tov_rate</w:t>
+            </w:r>
+          </w:p>
+        </w:tc>
+        <w:tc>
+          <w:tcPr>
+            <w:shd w:fill="auto" w:val="clear"/>
+            <w:tcMar>
+              <w:top w:w="100.0" w:type="dxa"/>
+              <w:left w:w="100.0" w:type="dxa"/>
+              <w:bottom w:w="100.0" w:type="dxa"/>
+              <w:right w:w="100.0" w:type="dxa"/>
+            </w:tcMar>
+            <w:vAlign w:val="top"/>
+          </w:tcPr>
+          <w:p>
+            <w:pPr>
+              <w:keepNext w:val="0"/>
+              <w:keepLines w:val="0"/>
+              <w:pageBreakBefore w:val="0"/>
+              <w:widowControl w:val="0"/>
+              <w:pBdr>
+                <w:top w:space="0" w:sz="0" w:val="nil"/>
+                <w:left w:space="0" w:sz="0" w:val="nil"/>
+                <w:bottom w:space="0" w:sz="0" w:val="nil"/>
+                <w:right w:space="0" w:sz="0" w:val="nil"/>
+                <w:between w:space="0" w:sz="0" w:val="nil"/>
+              </w:pBdr>
+              <w:shd w:fill="auto" w:val="clear"/>
+              <w:spacing w:after="0" w:before="0" w:line="240" w:lineRule="auto"/>
+              <w:ind w:left="0" w:right="0" w:firstLine="0"/>
+              <w:jc w:val="left"/>
+              <w:rPr/>
+            </w:pPr>
+            <w:r>
+              <w:rPr>
+                <w:rtl w:val="0"/>
+              </w:rPr>
+              <w:t xml:space="preserve">0.0363</w:t>
+            </w:r>
+          </w:p>
+        </w:tc>
+        <w:tc>
+          <w:tcPr>
+            <w:shd w:fill="auto" w:val="clear"/>
+            <w:tcMar>
+              <w:top w:w="100.0" w:type="dxa"/>
+              <w:left w:w="100.0" w:type="dxa"/>
+              <w:bottom w:w="100.0" w:type="dxa"/>
+              <w:right w:w="100.0" w:type="dxa"/>
+            </w:tcMar>
+            <w:vAlign w:val="top"/>
+          </w:tcPr>
+          <w:p>
+            <w:pPr>
+              <w:keepNext w:val="0"/>
+              <w:keepLines w:val="0"/>
+              <w:pageBreakBefore w:val="0"/>
+              <w:widowControl w:val="0"/>
+              <w:pBdr>
+                <w:top w:space="0" w:sz="0" w:val="nil"/>
+                <w:left w:space="0" w:sz="0" w:val="nil"/>
+                <w:bottom w:space="0" w:sz="0" w:val="nil"/>
+                <w:right w:space="0" w:sz="0" w:val="nil"/>
+                <w:between w:space="0" w:sz="0" w:val="nil"/>
+              </w:pBdr>
+              <w:shd w:fill="auto" w:val="clear"/>
+              <w:spacing w:after="0" w:before="0" w:line="240" w:lineRule="auto"/>
+              <w:ind w:left="0" w:right="0" w:firstLine="0"/>
+              <w:jc w:val="left"/>
+              <w:rPr/>
+            </w:pPr>
+            <w:r>
+              <w:rPr>
+                <w:rtl w:val="0"/>
+              </w:rPr>
+              <w:t xml:space="preserve">Difference in turnover percentage over the last 20 games</w:t>
+            </w:r>
+          </w:p>
+        </w:tc>
+      </w:tr>
+      <w:tr>
+        <w:trPr>
+          <w:cantSplit w:val="0"/>
+          <w:tblHeader w:val="0"/>
+        </w:trPr>
+        <w:tc>
+          <w:tcPr>
+            <w:shd w:fill="auto" w:val="clear"/>
+            <w:tcMar>
+              <w:top w:w="100.0" w:type="dxa"/>
+              <w:left w:w="100.0" w:type="dxa"/>
+              <w:bottom w:w="100.0" w:type="dxa"/>
+              <w:right w:w="100.0" w:type="dxa"/>
+            </w:tcMar>
+            <w:vAlign w:val="top"/>
+          </w:tcPr>
+          <w:p>
+            <w:pPr>
+              <w:keepNext w:val="0"/>
+              <w:keepLines w:val="0"/>
+              <w:pageBreakBefore w:val="0"/>
+              <w:widowControl w:val="0"/>
+              <w:pBdr>
+                <w:top w:space="0" w:sz="0" w:val="nil"/>
+                <w:left w:space="0" w:sz="0" w:val="nil"/>
+                <w:bottom w:space="0" w:sz="0" w:val="nil"/>
+                <w:right w:space="0" w:sz="0" w:val="nil"/>
+                <w:between w:space="0" w:sz="0" w:val="nil"/>
+              </w:pBdr>
+              <w:shd w:fill="auto" w:val="clear"/>
+              <w:spacing w:after="0" w:before="0" w:line="240" w:lineRule="auto"/>
+              <w:ind w:left="0" w:right="0" w:firstLine="0"/>
+              <w:jc w:val="left"/>
+              <w:rPr/>
+            </w:pPr>
+            <w:r>
+              <w:rPr>
+                <w:rtl w:val="0"/>
+              </w:rPr>
+              <w:t xml:space="preserve">home_rest_days_capped</w:t>
+            </w:r>
+          </w:p>
+        </w:tc>
+        <w:tc>
+          <w:tcPr>
+            <w:shd w:fill="auto" w:val="clear"/>
+            <w:tcMar>
+              <w:top w:w="100.0" w:type="dxa"/>
+              <w:left w:w="100.0" w:type="dxa"/>
+              <w:bottom w:w="100.0" w:type="dxa"/>
+              <w:right w:w="100.0" w:type="dxa"/>
+            </w:tcMar>
+            <w:vAlign w:val="top"/>
+          </w:tcPr>
+          <w:p>
+            <w:pPr>
+              <w:keepNext w:val="0"/>
+              <w:keepLines w:val="0"/>
+              <w:pageBreakBefore w:val="0"/>
+              <w:widowControl w:val="0"/>
+              <w:pBdr>
+                <w:top w:space="0" w:sz="0" w:val="nil"/>
+                <w:left w:space="0" w:sz="0" w:val="nil"/>
+                <w:bottom w:space="0" w:sz="0" w:val="nil"/>
+                <w:right w:space="0" w:sz="0" w:val="nil"/>
+                <w:between w:space="0" w:sz="0" w:val="nil"/>
+              </w:pBdr>
+              <w:shd w:fill="auto" w:val="clear"/>
+              <w:spacing w:after="0" w:before="0" w:line="240" w:lineRule="auto"/>
+              <w:ind w:left="0" w:right="0" w:firstLine="0"/>
+              <w:jc w:val="left"/>
+              <w:rPr/>
+            </w:pPr>
+            <w:r>
+              <w:rPr>
+                <w:rtl w:val="0"/>
+              </w:rPr>
+              <w:t xml:space="preserve">0.0336</w:t>
+            </w:r>
+          </w:p>
+        </w:tc>
+        <w:tc>
+          <w:tcPr>
+            <w:shd w:fill="auto" w:val="clear"/>
+            <w:tcMar>
+              <w:top w:w="100.0" w:type="dxa"/>
+              <w:left w:w="100.0" w:type="dxa"/>
+              <w:bottom w:w="100.0" w:type="dxa"/>
+              <w:right w:w="100.0" w:type="dxa"/>
+            </w:tcMar>
+            <w:vAlign w:val="top"/>
+          </w:tcPr>
+          <w:p>
+            <w:pPr>
+              <w:keepNext w:val="0"/>
+              <w:keepLines w:val="0"/>
+              <w:pageBreakBefore w:val="0"/>
+              <w:widowControl w:val="0"/>
+              <w:pBdr>
+                <w:top w:space="0" w:sz="0" w:val="nil"/>
+                <w:left w:space="0" w:sz="0" w:val="nil"/>
+                <w:bottom w:space="0" w:sz="0" w:val="nil"/>
+                <w:right w:space="0" w:sz="0" w:val="nil"/>
+                <w:between w:space="0" w:sz="0" w:val="nil"/>
+              </w:pBdr>
+              <w:shd w:fill="auto" w:val="clear"/>
+              <w:spacing w:after="0" w:before="0" w:line="240" w:lineRule="auto"/>
+              <w:ind w:left="0" w:right="0" w:firstLine="0"/>
+              <w:jc w:val="left"/>
+              <w:rPr/>
+            </w:pPr>
+            <w:r>
+              <w:rPr>
+                <w:rtl w:val="0"/>
+              </w:rPr>
+              <w:t xml:space="preserve">Number of rest days (0 - 4)</w:t>
+            </w:r>
+          </w:p>
+        </w:tc>
+      </w:tr>
+      <w:tr>
+        <w:trPr>
+          <w:cantSplit w:val="0"/>
+          <w:tblHeader w:val="0"/>
+        </w:trPr>
+        <w:tc>
+          <w:tcPr>
+            <w:shd w:fill="auto" w:val="clear"/>
+            <w:tcMar>
+              <w:top w:w="100.0" w:type="dxa"/>
+              <w:left w:w="100.0" w:type="dxa"/>
+              <w:bottom w:w="100.0" w:type="dxa"/>
+              <w:right w:w="100.0" w:type="dxa"/>
+            </w:tcMar>
+            <w:vAlign w:val="top"/>
+          </w:tcPr>
+          <w:p>
+            <w:pPr>
+              <w:keepNext w:val="0"/>
+              <w:keepLines w:val="0"/>
+              <w:pageBreakBefore w:val="0"/>
+              <w:widowControl w:val="0"/>
+              <w:pBdr>
+                <w:top w:space="0" w:sz="0" w:val="nil"/>
+                <w:left w:space="0" w:sz="0" w:val="nil"/>
+                <w:bottom w:space="0" w:sz="0" w:val="nil"/>
+                <w:right w:space="0" w:sz="0" w:val="nil"/>
+                <w:between w:space="0" w:sz="0" w:val="nil"/>
+              </w:pBdr>
+              <w:shd w:fill="auto" w:val="clear"/>
+              <w:spacing w:after="0" w:before="0" w:line="240" w:lineRule="auto"/>
+              <w:ind w:left="0" w:right="0" w:firstLine="0"/>
+              <w:jc w:val="left"/>
+              <w:rPr/>
+            </w:pPr>
+            <w:r>
+              <w:rPr>
+                <w:rtl w:val="0"/>
+              </w:rPr>
+              <w:t xml:space="preserve">h2h_margin_for_home</w:t>
+            </w:r>
+          </w:p>
+        </w:tc>
+        <w:tc>
+          <w:tcPr>
+            <w:shd w:fill="auto" w:val="clear"/>
+            <w:tcMar>
+              <w:top w:w="100.0" w:type="dxa"/>
+              <w:left w:w="100.0" w:type="dxa"/>
+              <w:bottom w:w="100.0" w:type="dxa"/>
+              <w:right w:w="100.0" w:type="dxa"/>
+            </w:tcMar>
+            <w:vAlign w:val="top"/>
+          </w:tcPr>
+          <w:p>
+            <w:pPr>
+              <w:keepNext w:val="0"/>
+              <w:keepLines w:val="0"/>
+              <w:pageBreakBefore w:val="0"/>
+              <w:widowControl w:val="0"/>
+              <w:pBdr>
+                <w:top w:space="0" w:sz="0" w:val="nil"/>
+                <w:left w:space="0" w:sz="0" w:val="nil"/>
+                <w:bottom w:space="0" w:sz="0" w:val="nil"/>
+                <w:right w:space="0" w:sz="0" w:val="nil"/>
+                <w:between w:space="0" w:sz="0" w:val="nil"/>
+              </w:pBdr>
+              <w:shd w:fill="auto" w:val="clear"/>
+              <w:spacing w:after="0" w:before="0" w:line="240" w:lineRule="auto"/>
+              <w:ind w:left="0" w:right="0" w:firstLine="0"/>
+              <w:jc w:val="left"/>
+              <w:rPr/>
+            </w:pPr>
+            <w:r>
+              <w:rPr>
+                <w:rtl w:val="0"/>
+              </w:rPr>
+              <w:t xml:space="preserve">0.0335</w:t>
+            </w:r>
+          </w:p>
+        </w:tc>
+        <w:tc>
+          <w:tcPr>
+            <w:shd w:fill="auto" w:val="clear"/>
+            <w:tcMar>
+              <w:top w:w="100.0" w:type="dxa"/>
+              <w:left w:w="100.0" w:type="dxa"/>
+              <w:bottom w:w="100.0" w:type="dxa"/>
+              <w:right w:w="100.0" w:type="dxa"/>
+            </w:tcMar>
+            <w:vAlign w:val="top"/>
+          </w:tcPr>
+          <w:p>
+            <w:pPr>
+              <w:keepNext w:val="0"/>
+              <w:keepLines w:val="0"/>
+              <w:pageBreakBefore w:val="0"/>
+              <w:widowControl w:val="0"/>
+              <w:pBdr>
+                <w:top w:space="0" w:sz="0" w:val="nil"/>
+                <w:left w:space="0" w:sz="0" w:val="nil"/>
+                <w:bottom w:space="0" w:sz="0" w:val="nil"/>
+                <w:right w:space="0" w:sz="0" w:val="nil"/>
+                <w:between w:space="0" w:sz="0" w:val="nil"/>
+              </w:pBdr>
+              <w:shd w:fill="auto" w:val="clear"/>
+              <w:spacing w:after="0" w:before="0" w:line="240" w:lineRule="auto"/>
+              <w:ind w:left="0" w:right="0" w:firstLine="0"/>
+              <w:jc w:val="left"/>
+              <w:rPr/>
+            </w:pPr>
+            <w:r>
+              <w:rPr>
+                <w:rtl w:val="0"/>
+              </w:rPr>
+              <w:t xml:space="preserve">The previous 5 margins for the same two teams</w:t>
+            </w:r>
+          </w:p>
+        </w:tc>
+      </w:tr>
+      <w:tr>
+        <w:trPr>
+          <w:cantSplit w:val="0"/>
+          <w:tblHeader w:val="0"/>
+        </w:trPr>
+        <w:tc>
+          <w:tcPr>
+            <w:shd w:fill="auto" w:val="clear"/>
+            <w:tcMar>
+              <w:top w:w="100.0" w:type="dxa"/>
+              <w:left w:w="100.0" w:type="dxa"/>
+              <w:bottom w:w="100.0" w:type="dxa"/>
+              <w:right w:w="100.0" w:type="dxa"/>
+            </w:tcMar>
+            <w:vAlign w:val="top"/>
+          </w:tcPr>
+          <w:p>
+            <w:pPr>
+              <w:keepNext w:val="0"/>
+              <w:keepLines w:val="0"/>
+              <w:pageBreakBefore w:val="0"/>
+              <w:widowControl w:val="0"/>
+              <w:pBdr>
+                <w:top w:space="0" w:sz="0" w:val="nil"/>
+                <w:left w:space="0" w:sz="0" w:val="nil"/>
+                <w:bottom w:space="0" w:sz="0" w:val="nil"/>
+                <w:right w:space="0" w:sz="0" w:val="nil"/>
+                <w:between w:space="0" w:sz="0" w:val="nil"/>
+              </w:pBdr>
+              <w:shd w:fill="auto" w:val="clear"/>
+              <w:spacing w:after="0" w:before="0" w:line="240" w:lineRule="auto"/>
+              <w:ind w:left="0" w:right="0" w:firstLine="0"/>
+              <w:jc w:val="left"/>
+              <w:rPr/>
+            </w:pPr>
+            <w:r>
+              <w:rPr>
+                <w:rtl w:val="0"/>
+              </w:rPr>
+              <w:t xml:space="preserve">diff_roll20_ts</w:t>
+            </w:r>
+          </w:p>
+        </w:tc>
+        <w:tc>
+          <w:tcPr>
+            <w:shd w:fill="auto" w:val="clear"/>
+            <w:tcMar>
+              <w:top w:w="100.0" w:type="dxa"/>
+              <w:left w:w="100.0" w:type="dxa"/>
+              <w:bottom w:w="100.0" w:type="dxa"/>
+              <w:right w:w="100.0" w:type="dxa"/>
+            </w:tcMar>
+            <w:vAlign w:val="top"/>
+          </w:tcPr>
+          <w:p>
+            <w:pPr>
+              <w:keepNext w:val="0"/>
+              <w:keepLines w:val="0"/>
+              <w:pageBreakBefore w:val="0"/>
+              <w:widowControl w:val="0"/>
+              <w:pBdr>
+                <w:top w:space="0" w:sz="0" w:val="nil"/>
+                <w:left w:space="0" w:sz="0" w:val="nil"/>
+                <w:bottom w:space="0" w:sz="0" w:val="nil"/>
+                <w:right w:space="0" w:sz="0" w:val="nil"/>
+                <w:between w:space="0" w:sz="0" w:val="nil"/>
+              </w:pBdr>
+              <w:shd w:fill="auto" w:val="clear"/>
+              <w:spacing w:after="0" w:before="0" w:line="240" w:lineRule="auto"/>
+              <w:ind w:left="0" w:right="0" w:firstLine="0"/>
+              <w:jc w:val="left"/>
+              <w:rPr/>
+            </w:pPr>
+            <w:r>
+              <w:rPr>
+                <w:rtl w:val="0"/>
+              </w:rPr>
+              <w:t xml:space="preserve">0.0334</w:t>
+            </w:r>
+          </w:p>
+        </w:tc>
+        <w:tc>
+          <w:tcPr>
+            <w:shd w:fill="auto" w:val="clear"/>
+            <w:tcMar>
+              <w:top w:w="100.0" w:type="dxa"/>
+              <w:left w:w="100.0" w:type="dxa"/>
+              <w:bottom w:w="100.0" w:type="dxa"/>
+              <w:right w:w="100.0" w:type="dxa"/>
+            </w:tcMar>
+            <w:vAlign w:val="top"/>
+          </w:tcPr>
+          <w:p>
+            <w:pPr>
+              <w:keepNext w:val="0"/>
+              <w:keepLines w:val="0"/>
+              <w:pageBreakBefore w:val="0"/>
+              <w:widowControl w:val="0"/>
+              <w:pBdr>
+                <w:top w:space="0" w:sz="0" w:val="nil"/>
+                <w:left w:space="0" w:sz="0" w:val="nil"/>
+                <w:bottom w:space="0" w:sz="0" w:val="nil"/>
+                <w:right w:space="0" w:sz="0" w:val="nil"/>
+                <w:between w:space="0" w:sz="0" w:val="nil"/>
+              </w:pBdr>
+              <w:shd w:fill="auto" w:val="clear"/>
+              <w:spacing w:after="0" w:before="0" w:line="240" w:lineRule="auto"/>
+              <w:ind w:left="0" w:right="0" w:firstLine="0"/>
+              <w:jc w:val="left"/>
+              <w:rPr/>
+            </w:pPr>
+            <w:r>
+              <w:rPr>
+                <w:rtl w:val="0"/>
+              </w:rPr>
+              <w:t xml:space="preserve">Difference in true shooting percentage over the last 20 games</w:t>
+            </w:r>
+          </w:p>
+        </w:tc>
+      </w:tr>
+      <w:tr>
+        <w:trPr>
+          <w:cantSplit w:val="0"/>
+          <w:tblHeader w:val="0"/>
+        </w:trPr>
+        <w:tc>
+          <w:tcPr>
+            <w:shd w:fill="auto" w:val="clear"/>
+            <w:tcMar>
+              <w:top w:w="100.0" w:type="dxa"/>
+              <w:left w:w="100.0" w:type="dxa"/>
+              <w:bottom w:w="100.0" w:type="dxa"/>
+              <w:right w:w="100.0" w:type="dxa"/>
+            </w:tcMar>
+            <w:vAlign w:val="top"/>
+          </w:tcPr>
+          <w:p>
+            <w:pPr>
+              <w:keepNext w:val="0"/>
+              <w:keepLines w:val="0"/>
+              <w:pageBreakBefore w:val="0"/>
+              <w:widowControl w:val="0"/>
+              <w:pBdr>
+                <w:top w:space="0" w:sz="0" w:val="nil"/>
+                <w:left w:space="0" w:sz="0" w:val="nil"/>
+                <w:bottom w:space="0" w:sz="0" w:val="nil"/>
+                <w:right w:space="0" w:sz="0" w:val="nil"/>
+                <w:between w:space="0" w:sz="0" w:val="nil"/>
+              </w:pBdr>
+              <w:shd w:fill="auto" w:val="clear"/>
+              <w:spacing w:after="0" w:before="0" w:line="240" w:lineRule="auto"/>
+              <w:ind w:left="0" w:right="0" w:firstLine="0"/>
+              <w:jc w:val="left"/>
+              <w:rPr/>
+            </w:pPr>
+            <w:r>
+              <w:rPr>
+                <w:rtl w:val="0"/>
+              </w:rPr>
+              <w:t xml:space="preserve">away_rest_days_capped</w:t>
+            </w:r>
+          </w:p>
+        </w:tc>
+        <w:tc>
+          <w:tcPr>
+            <w:shd w:fill="auto" w:val="clear"/>
+            <w:tcMar>
+              <w:top w:w="100.0" w:type="dxa"/>
+              <w:left w:w="100.0" w:type="dxa"/>
+              <w:bottom w:w="100.0" w:type="dxa"/>
+              <w:right w:w="100.0" w:type="dxa"/>
+            </w:tcMar>
+            <w:vAlign w:val="top"/>
+          </w:tcPr>
+          <w:p>
+            <w:pPr>
+              <w:keepNext w:val="0"/>
+              <w:keepLines w:val="0"/>
+              <w:pageBreakBefore w:val="0"/>
+              <w:widowControl w:val="0"/>
+              <w:pBdr>
+                <w:top w:space="0" w:sz="0" w:val="nil"/>
+                <w:left w:space="0" w:sz="0" w:val="nil"/>
+                <w:bottom w:space="0" w:sz="0" w:val="nil"/>
+                <w:right w:space="0" w:sz="0" w:val="nil"/>
+                <w:between w:space="0" w:sz="0" w:val="nil"/>
+              </w:pBdr>
+              <w:shd w:fill="auto" w:val="clear"/>
+              <w:spacing w:after="0" w:before="0" w:line="240" w:lineRule="auto"/>
+              <w:ind w:left="0" w:right="0" w:firstLine="0"/>
+              <w:jc w:val="left"/>
+              <w:rPr/>
+            </w:pPr>
+            <w:r>
+              <w:rPr>
+                <w:rtl w:val="0"/>
+              </w:rPr>
+              <w:t xml:space="preserve">0.0269</w:t>
+            </w:r>
+          </w:p>
+        </w:tc>
+        <w:tc>
+          <w:tcPr>
+            <w:shd w:fill="auto" w:val="clear"/>
+            <w:tcMar>
+              <w:top w:w="100.0" w:type="dxa"/>
+              <w:left w:w="100.0" w:type="dxa"/>
+              <w:bottom w:w="100.0" w:type="dxa"/>
+              <w:right w:w="100.0" w:type="dxa"/>
+            </w:tcMar>
+            <w:vAlign w:val="top"/>
+          </w:tcPr>
+          <w:p>
+            <w:pPr>
+              <w:keepNext w:val="0"/>
+              <w:keepLines w:val="0"/>
+              <w:pageBreakBefore w:val="0"/>
+              <w:widowControl w:val="0"/>
+              <w:pBdr>
+                <w:top w:space="0" w:sz="0" w:val="nil"/>
+                <w:left w:space="0" w:sz="0" w:val="nil"/>
+                <w:bottom w:space="0" w:sz="0" w:val="nil"/>
+                <w:right w:space="0" w:sz="0" w:val="nil"/>
+                <w:between w:space="0" w:sz="0" w:val="nil"/>
+              </w:pBdr>
+              <w:shd w:fill="auto" w:val="clear"/>
+              <w:spacing w:after="0" w:before="0" w:line="240" w:lineRule="auto"/>
+              <w:ind w:left="0" w:right="0" w:firstLine="0"/>
+              <w:jc w:val="left"/>
+              <w:rPr/>
+            </w:pPr>
+            <w:r>
+              <w:rPr>
+                <w:rtl w:val="0"/>
+              </w:rPr>
+              <w:t xml:space="preserve">Number of rest days (0 - 4)</w:t>
+            </w:r>
+          </w:p>
+        </w:tc>
+      </w:tr>
+      <w:tr>
+        <w:trPr>
+          <w:cantSplit w:val="0"/>
+          <w:tblHeader w:val="0"/>
+        </w:trPr>
+        <w:tc>
+          <w:tcPr>
+            <w:shd w:fill="auto" w:val="clear"/>
+            <w:tcMar>
+              <w:top w:w="100.0" w:type="dxa"/>
+              <w:left w:w="100.0" w:type="dxa"/>
+              <w:bottom w:w="100.0" w:type="dxa"/>
+              <w:right w:w="100.0" w:type="dxa"/>
+            </w:tcMar>
+            <w:vAlign w:val="top"/>
+          </w:tcPr>
+          <w:p>
+            <w:pPr>
+              <w:keepNext w:val="0"/>
+              <w:keepLines w:val="0"/>
+              <w:pageBreakBefore w:val="0"/>
+              <w:widowControl w:val="0"/>
+              <w:pBdr>
+                <w:top w:space="0" w:sz="0" w:val="nil"/>
+                <w:left w:space="0" w:sz="0" w:val="nil"/>
+                <w:bottom w:space="0" w:sz="0" w:val="nil"/>
+                <w:right w:space="0" w:sz="0" w:val="nil"/>
+                <w:between w:space="0" w:sz="0" w:val="nil"/>
+              </w:pBdr>
+              <w:shd w:fill="auto" w:val="clear"/>
+              <w:spacing w:after="0" w:before="0" w:line="240" w:lineRule="auto"/>
+              <w:ind w:left="0" w:right="0" w:firstLine="0"/>
+              <w:jc w:val="left"/>
+              <w:rPr/>
+            </w:pPr>
+            <w:r>
+              <w:rPr>
+                <w:rtl w:val="0"/>
+              </w:rPr>
+              <w:t xml:space="preserve">diff_roll20_3pa_rate</w:t>
+            </w:r>
+          </w:p>
+        </w:tc>
+        <w:tc>
+          <w:tcPr>
+            <w:shd w:fill="auto" w:val="clear"/>
+            <w:tcMar>
+              <w:top w:w="100.0" w:type="dxa"/>
+              <w:left w:w="100.0" w:type="dxa"/>
+              <w:bottom w:w="100.0" w:type="dxa"/>
+              <w:right w:w="100.0" w:type="dxa"/>
+            </w:tcMar>
+            <w:vAlign w:val="top"/>
+          </w:tcPr>
+          <w:p>
+            <w:pPr>
+              <w:keepNext w:val="0"/>
+              <w:keepLines w:val="0"/>
+              <w:pageBreakBefore w:val="0"/>
+              <w:widowControl w:val="0"/>
+              <w:pBdr>
+                <w:top w:space="0" w:sz="0" w:val="nil"/>
+                <w:left w:space="0" w:sz="0" w:val="nil"/>
+                <w:bottom w:space="0" w:sz="0" w:val="nil"/>
+                <w:right w:space="0" w:sz="0" w:val="nil"/>
+                <w:between w:space="0" w:sz="0" w:val="nil"/>
+              </w:pBdr>
+              <w:shd w:fill="auto" w:val="clear"/>
+              <w:spacing w:after="0" w:before="0" w:line="240" w:lineRule="auto"/>
+              <w:ind w:left="0" w:right="0" w:firstLine="0"/>
+              <w:jc w:val="left"/>
+              <w:rPr/>
+            </w:pPr>
+            <w:r>
+              <w:rPr>
+                <w:rtl w:val="0"/>
+              </w:rPr>
+              <w:t xml:space="preserve">0.0255</w:t>
+            </w:r>
+          </w:p>
+        </w:tc>
+        <w:tc>
+          <w:tcPr>
+            <w:shd w:fill="auto" w:val="clear"/>
+            <w:tcMar>
+              <w:top w:w="100.0" w:type="dxa"/>
+              <w:left w:w="100.0" w:type="dxa"/>
+              <w:bottom w:w="100.0" w:type="dxa"/>
+              <w:right w:w="100.0" w:type="dxa"/>
+            </w:tcMar>
+            <w:vAlign w:val="top"/>
+          </w:tcPr>
+          <w:p>
+            <w:pPr>
+              <w:widowControl w:val="0"/>
+              <w:spacing w:line="240" w:lineRule="auto"/>
+              <w:rPr/>
+            </w:pPr>
+            <w:r>
+              <w:rPr>
+                <w:rtl w:val="0"/>
+              </w:rPr>
+              <w:t xml:space="preserve">Difference in 3-point attempt rate over the last 20 games</w:t>
+            </w:r>
+          </w:p>
+        </w:tc>
+      </w:tr>
+      <w:tr>
+        <w:trPr>
+          <w:cantSplit w:val="0"/>
+          <w:tblHeader w:val="0"/>
+        </w:trPr>
+        <w:tc>
+          <w:tcPr>
+            <w:shd w:fill="auto" w:val="clear"/>
+            <w:tcMar>
+              <w:top w:w="100.0" w:type="dxa"/>
+              <w:left w:w="100.0" w:type="dxa"/>
+              <w:bottom w:w="100.0" w:type="dxa"/>
+              <w:right w:w="100.0" w:type="dxa"/>
+            </w:tcMar>
+            <w:vAlign w:val="top"/>
+          </w:tcPr>
+          <w:p>
+            <w:pPr>
+              <w:keepNext w:val="0"/>
+              <w:keepLines w:val="0"/>
+              <w:pageBreakBefore w:val="0"/>
+              <w:widowControl w:val="0"/>
+              <w:pBdr>
+                <w:top w:space="0" w:sz="0" w:val="nil"/>
+                <w:left w:space="0" w:sz="0" w:val="nil"/>
+                <w:bottom w:space="0" w:sz="0" w:val="nil"/>
+                <w:right w:space="0" w:sz="0" w:val="nil"/>
+                <w:between w:space="0" w:sz="0" w:val="nil"/>
+              </w:pBdr>
+              <w:shd w:fill="auto" w:val="clear"/>
+              <w:spacing w:after="0" w:before="0" w:line="240" w:lineRule="auto"/>
+              <w:ind w:left="0" w:right="0" w:firstLine="0"/>
+              <w:jc w:val="left"/>
+              <w:rPr/>
+            </w:pPr>
+            <w:r>
+              <w:rPr>
+                <w:rtl w:val="0"/>
+              </w:rPr>
+              <w:t xml:space="preserve">Away_b2b</w:t>
+            </w:r>
+          </w:p>
+        </w:tc>
+        <w:tc>
+          <w:tcPr>
+            <w:shd w:fill="auto" w:val="clear"/>
+            <w:tcMar>
+              <w:top w:w="100.0" w:type="dxa"/>
+              <w:left w:w="100.0" w:type="dxa"/>
+              <w:bottom w:w="100.0" w:type="dxa"/>
+              <w:right w:w="100.0" w:type="dxa"/>
+            </w:tcMar>
+            <w:vAlign w:val="top"/>
+          </w:tcPr>
+          <w:p>
+            <w:pPr>
+              <w:keepNext w:val="0"/>
+              <w:keepLines w:val="0"/>
+              <w:pageBreakBefore w:val="0"/>
+              <w:widowControl w:val="0"/>
+              <w:pBdr>
+                <w:top w:space="0" w:sz="0" w:val="nil"/>
+                <w:left w:space="0" w:sz="0" w:val="nil"/>
+                <w:bottom w:space="0" w:sz="0" w:val="nil"/>
+                <w:right w:space="0" w:sz="0" w:val="nil"/>
+                <w:between w:space="0" w:sz="0" w:val="nil"/>
+              </w:pBdr>
+              <w:shd w:fill="auto" w:val="clear"/>
+              <w:spacing w:after="0" w:before="0" w:line="240" w:lineRule="auto"/>
+              <w:ind w:left="0" w:right="0" w:firstLine="0"/>
+              <w:jc w:val="left"/>
+              <w:rPr/>
+            </w:pPr>
+            <w:r>
+              <w:rPr>
+                <w:rtl w:val="0"/>
+              </w:rPr>
+              <w:t xml:space="preserve">0.0219</w:t>
+            </w:r>
+          </w:p>
+        </w:tc>
+        <w:tc>
+          <w:tcPr>
+            <w:shd w:fill="auto" w:val="clear"/>
+            <w:tcMar>
+              <w:top w:w="100.0" w:type="dxa"/>
+              <w:left w:w="100.0" w:type="dxa"/>
+              <w:bottom w:w="100.0" w:type="dxa"/>
+              <w:right w:w="100.0" w:type="dxa"/>
+            </w:tcMar>
+            <w:vAlign w:val="top"/>
+          </w:tcPr>
+          <w:p>
+            <w:pPr>
+              <w:keepNext w:val="0"/>
+              <w:keepLines w:val="0"/>
+              <w:pageBreakBefore w:val="0"/>
+              <w:widowControl w:val="0"/>
+              <w:pBdr>
+                <w:top w:space="0" w:sz="0" w:val="nil"/>
+                <w:left w:space="0" w:sz="0" w:val="nil"/>
+                <w:bottom w:space="0" w:sz="0" w:val="nil"/>
+                <w:right w:space="0" w:sz="0" w:val="nil"/>
+                <w:between w:space="0" w:sz="0" w:val="nil"/>
+              </w:pBdr>
+              <w:shd w:fill="auto" w:val="clear"/>
+              <w:spacing w:after="0" w:before="0" w:line="240" w:lineRule="auto"/>
+              <w:ind w:left="0" w:right="0" w:firstLine="0"/>
+              <w:jc w:val="left"/>
+              <w:rPr/>
+            </w:pPr>
+            <w:r>
+              <w:rPr>
+                <w:rtl w:val="0"/>
+              </w:rPr>
+              <w:t xml:space="preserve">Flag for the away team having a game on the previous day</w:t>
+            </w:r>
+          </w:p>
+        </w:tc>
+      </w:tr>
+      <w:tr>
+        <w:trPr>
+          <w:cantSplit w:val="0"/>
+          <w:tblHeader w:val="0"/>
+        </w:trPr>
+        <w:tc>
+          <w:tcPr>
+            <w:shd w:fill="auto" w:val="clear"/>
+            <w:tcMar>
+              <w:top w:w="100.0" w:type="dxa"/>
+              <w:left w:w="100.0" w:type="dxa"/>
+              <w:bottom w:w="100.0" w:type="dxa"/>
+              <w:right w:w="100.0" w:type="dxa"/>
+            </w:tcMar>
+            <w:vAlign w:val="top"/>
+          </w:tcPr>
+          <w:p>
+            <w:pPr>
+              <w:keepNext w:val="0"/>
+              <w:keepLines w:val="0"/>
+              <w:pageBreakBefore w:val="0"/>
+              <w:widowControl w:val="0"/>
+              <w:pBdr>
+                <w:top w:space="0" w:sz="0" w:val="nil"/>
+                <w:left w:space="0" w:sz="0" w:val="nil"/>
+                <w:bottom w:space="0" w:sz="0" w:val="nil"/>
+                <w:right w:space="0" w:sz="0" w:val="nil"/>
+                <w:between w:space="0" w:sz="0" w:val="nil"/>
+              </w:pBdr>
+              <w:shd w:fill="auto" w:val="clear"/>
+              <w:spacing w:after="0" w:before="0" w:line="240" w:lineRule="auto"/>
+              <w:ind w:left="0" w:right="0" w:firstLine="0"/>
+              <w:jc w:val="left"/>
+              <w:rPr/>
+            </w:pPr>
+            <w:r>
+              <w:rPr>
+                <w:rtl w:val="0"/>
+              </w:rPr>
+              <w:t xml:space="preserve">Home_b2b</w:t>
+            </w:r>
+          </w:p>
+        </w:tc>
+        <w:tc>
+          <w:tcPr>
+            <w:shd w:fill="auto" w:val="clear"/>
+            <w:tcMar>
+              <w:top w:w="100.0" w:type="dxa"/>
+              <w:left w:w="100.0" w:type="dxa"/>
+              <w:bottom w:w="100.0" w:type="dxa"/>
+              <w:right w:w="100.0" w:type="dxa"/>
+            </w:tcMar>
+            <w:vAlign w:val="top"/>
+          </w:tcPr>
+          <w:p>
+            <w:pPr>
+              <w:keepNext w:val="0"/>
+              <w:keepLines w:val="0"/>
+              <w:pageBreakBefore w:val="0"/>
+              <w:widowControl w:val="0"/>
+              <w:pBdr>
+                <w:top w:space="0" w:sz="0" w:val="nil"/>
+                <w:left w:space="0" w:sz="0" w:val="nil"/>
+                <w:bottom w:space="0" w:sz="0" w:val="nil"/>
+                <w:right w:space="0" w:sz="0" w:val="nil"/>
+                <w:between w:space="0" w:sz="0" w:val="nil"/>
+              </w:pBdr>
+              <w:shd w:fill="auto" w:val="clear"/>
+              <w:spacing w:after="0" w:before="0" w:line="240" w:lineRule="auto"/>
+              <w:ind w:left="0" w:right="0" w:firstLine="0"/>
+              <w:jc w:val="left"/>
+              <w:rPr/>
+            </w:pPr>
+            <w:r>
+              <w:rPr>
+                <w:rtl w:val="0"/>
+              </w:rPr>
+              <w:t xml:space="preserve">0.0209</w:t>
+            </w:r>
+          </w:p>
+        </w:tc>
+        <w:tc>
+          <w:tcPr>
+            <w:shd w:fill="auto" w:val="clear"/>
+            <w:tcMar>
+              <w:top w:w="100.0" w:type="dxa"/>
+              <w:left w:w="100.0" w:type="dxa"/>
+              <w:bottom w:w="100.0" w:type="dxa"/>
+              <w:right w:w="100.0" w:type="dxa"/>
+            </w:tcMar>
+            <w:vAlign w:val="top"/>
+          </w:tcPr>
+          <w:p>
+            <w:pPr>
+              <w:widowControl w:val="0"/>
+              <w:spacing w:line="240" w:lineRule="auto"/>
+              <w:rPr/>
+            </w:pPr>
+            <w:r>
+              <w:rPr>
+                <w:rtl w:val="0"/>
+              </w:rPr>
+              <w:t xml:space="preserve">Flag for the home team having a game on the previous day</w:t>
+            </w:r>
+          </w:p>
+        </w:tc>
+      </w:tr>
+    </w:tbl>
     <w:p>
       <w:pPr>
         <w:pBdr>
@@ -1500,10 +4079,25 @@
           <w:between w:color="auto" w:space="0" w:sz="0" w:val="none"/>
         </w:pBdr>
         <w:spacing w:after="240" w:before="240" w:line="360" w:lineRule="auto"/>
-        <w:rPr>
-          <w:b w:val="1"/>
-          <w:bCs w:val="1"/>
-        </w:rPr>
+        <w:rPr/>
+      </w:pPr>
+      <w:r>
+        <w:rPr>
+          <w:rtl w:val="0"/>
+        </w:rPr>
+        <w:t xml:space="preserve">We noticed that home_indicator had no importance, which led us to the conclusion that the home interaction was learned through all of the “diff” variables and that the flag wasn’t contributing anything because of that.</w:t>
+      </w:r>
+    </w:p>
+    <w:p>
+      <w:pPr>
+        <w:pBdr>
+          <w:top w:color="auto" w:space="0" w:sz="0" w:val="none"/>
+          <w:bottom w:color="auto" w:space="0" w:sz="0" w:val="none"/>
+          <w:right w:color="auto" w:space="0" w:sz="0" w:val="none"/>
+          <w:between w:color="auto" w:space="0" w:sz="0" w:val="none"/>
+        </w:pBdr>
+        <w:spacing w:after="240" w:before="240" w:line="360" w:lineRule="auto"/>
+        <w:rPr/>
       </w:pPr>
       <w:r>
         <w:rPr>
@@ -1511,6 +4105,148 @@
         </w:rPr>
         <w:t xml:space="preserve">One important choice was keeping the tree depth very shallow (max_depth = 2). This means each tree can only learn simple splits and basic interactions between variables, rather than building very complex rules. Using shallow trees helps keep the model stable and prevents it from fitting noise in the training data. Instead of relying on a few complicated trees, the model improves predictions gradually by combining many small, simple trees.</w:t>
       </w:r>
+    </w:p>
+    <w:p>
+      <w:pPr>
+        <w:pBdr>
+          <w:top w:color="auto" w:space="0" w:sz="0" w:val="none"/>
+          <w:bottom w:color="auto" w:space="0" w:sz="0" w:val="none"/>
+          <w:right w:color="auto" w:space="0" w:sz="0" w:val="none"/>
+          <w:between w:color="auto" w:space="0" w:sz="0" w:val="none"/>
+        </w:pBdr>
+        <w:spacing w:after="240" w:before="240" w:line="360" w:lineRule="auto"/>
+        <w:rPr>
+          <w:u w:val="single"/>
+        </w:rPr>
+      </w:pPr>
+      <w:r>
+        <w:rPr>
+          <w:u w:val="single"/>
+          <w:rtl w:val="0"/>
+        </w:rPr>
+        <w:t xml:space="preserve">Predictions</w:t>
+      </w:r>
+    </w:p>
+    <w:p>
+      <w:pPr>
+        <w:pBdr>
+          <w:top w:color="auto" w:space="0" w:sz="0" w:val="none"/>
+          <w:bottom w:color="auto" w:space="0" w:sz="0" w:val="none"/>
+          <w:right w:color="auto" w:space="0" w:sz="0" w:val="none"/>
+          <w:between w:color="auto" w:space="0" w:sz="0" w:val="none"/>
+        </w:pBdr>
+        <w:spacing w:after="240" w:before="240" w:line="360" w:lineRule="auto"/>
+        <w:rPr/>
+      </w:pPr>
+      <w:r>
+        <w:rPr>
+          <w:rtl w:val="0"/>
+        </w:rPr>
+        <w:t xml:space="preserve">For each scheduled game from March 14 to April 12, 2026, the spread prediction is generated with an XGBoost regressor using only information available before tip-off. The script builds a leak-free feature vector from each team’s prior game history, including recent scoring margin, season net and defensive rating, home/road split margin, rest days, back-to-back indicators, rolling true shooting, three-point attempt rate, turnover rate, and recent head-to-head margin. Any missing feature values are replaced with the training-set medians, and the fitted XGBoost model then outputs the predicted spread, defined as expected home points minus away points.</w:t>
+      </w:r>
+    </w:p>
+    <w:p>
+      <w:pPr>
+        <w:pBdr>
+          <w:top w:color="auto" w:space="0" w:sz="0" w:val="none"/>
+          <w:bottom w:color="auto" w:space="0" w:sz="0" w:val="none"/>
+          <w:right w:color="auto" w:space="0" w:sz="0" w:val="none"/>
+          <w:between w:color="auto" w:space="0" w:sz="0" w:val="none"/>
+        </w:pBdr>
+        <w:spacing w:after="240" w:before="240" w:line="360" w:lineRule="auto"/>
+        <w:rPr/>
+      </w:pPr>
+      <w:r>
+        <w:rPr>
+          <w:rtl w:val="0"/>
+        </w:rPr>
+      </w:r>
+    </w:p>
+    <w:p>
+      <w:pPr>
+        <w:pBdr>
+          <w:top w:color="auto" w:space="0" w:sz="0" w:val="none"/>
+          <w:bottom w:color="auto" w:space="0" w:sz="0" w:val="none"/>
+          <w:right w:color="auto" w:space="0" w:sz="0" w:val="none"/>
+          <w:between w:color="auto" w:space="0" w:sz="0" w:val="none"/>
+        </w:pBdr>
+        <w:spacing w:after="240" w:before="240" w:line="360" w:lineRule="auto"/>
+        <w:rPr/>
+      </w:pPr>
+      <w:r>
+        <w:rPr>
+          <w:rtl w:val="0"/>
+        </w:rPr>
+      </w:r>
+    </w:p>
+    <w:p>
+      <w:pPr>
+        <w:pBdr>
+          <w:top w:color="auto" w:space="0" w:sz="0" w:val="none"/>
+          <w:bottom w:color="auto" w:space="0" w:sz="0" w:val="none"/>
+          <w:right w:color="auto" w:space="0" w:sz="0" w:val="none"/>
+          <w:between w:color="auto" w:space="0" w:sz="0" w:val="none"/>
+        </w:pBdr>
+        <w:spacing w:after="240" w:before="240" w:line="360" w:lineRule="auto"/>
+        <w:rPr>
+          <w:u w:val="single"/>
+        </w:rPr>
+      </w:pPr>
+      <w:r>
+        <w:rPr>
+          <w:rtl w:val="0"/>
+        </w:rPr>
+      </w:r>
+    </w:p>
+    <w:p>
+      <w:pPr>
+        <w:pBdr>
+          <w:top w:color="auto" w:space="0" w:sz="0" w:val="none"/>
+          <w:bottom w:color="auto" w:space="0" w:sz="0" w:val="none"/>
+          <w:right w:color="auto" w:space="0" w:sz="0" w:val="none"/>
+          <w:between w:color="auto" w:space="0" w:sz="0" w:val="none"/>
+        </w:pBdr>
+        <w:spacing w:after="240" w:before="240" w:line="360" w:lineRule="auto"/>
+        <w:rPr>
+          <w:u w:val="single"/>
+        </w:rPr>
+      </w:pPr>
+      <w:r>
+        <w:rPr>
+          <w:rtl w:val="0"/>
+        </w:rPr>
+      </w:r>
+    </w:p>
+    <w:p>
+      <w:pPr>
+        <w:pBdr>
+          <w:top w:color="auto" w:space="0" w:sz="0" w:val="none"/>
+          <w:bottom w:color="auto" w:space="0" w:sz="0" w:val="none"/>
+          <w:right w:color="auto" w:space="0" w:sz="0" w:val="none"/>
+          <w:between w:color="auto" w:space="0" w:sz="0" w:val="none"/>
+        </w:pBdr>
+        <w:spacing w:after="240" w:before="240" w:line="360" w:lineRule="auto"/>
+        <w:rPr>
+          <w:u w:val="single"/>
+        </w:rPr>
+      </w:pPr>
+      <w:r>
+        <w:rPr>
+          <w:rtl w:val="0"/>
+        </w:rPr>
+      </w:r>
+    </w:p>
+    <w:p>
+      <w:pPr>
+        <w:pBdr>
+          <w:top w:color="auto" w:space="0" w:sz="0" w:val="none"/>
+          <w:bottom w:color="auto" w:space="0" w:sz="0" w:val="none"/>
+          <w:right w:color="auto" w:space="0" w:sz="0" w:val="none"/>
+          <w:between w:color="auto" w:space="0" w:sz="0" w:val="none"/>
+        </w:pBdr>
+        <w:spacing w:after="240" w:before="240" w:line="360" w:lineRule="auto"/>
+        <w:rPr/>
+      </w:pPr>
       <w:r>
         <w:rPr>
           <w:rtl w:val="0"/>
@@ -1758,119 +4494,6 @@
         <w:ind w:left="720" w:hanging="360"/>
       </w:pPr>
       <w:rPr>
-        <w:rFonts w:ascii="Arial" w:cs="Arial" w:eastAsia="Arial" w:hAnsi="Arial"/>
-        <w:sz w:val="20"/>
-        <w:szCs w:val="20"/>
-        <w:u w:val="none"/>
-      </w:rPr>
-    </w:lvl>
-    <w:lvl w:ilvl="1">
-      <w:start w:val="1"/>
-      <w:numFmt w:val="bullet"/>
-      <w:lvlText w:val="○"/>
-      <w:lvlJc w:val="left"/>
-      <w:pPr>
-        <w:ind w:left="1440" w:hanging="360"/>
-      </w:pPr>
-      <w:rPr>
-        <w:u w:val="none"/>
-      </w:rPr>
-    </w:lvl>
-    <w:lvl w:ilvl="2">
-      <w:start w:val="1"/>
-      <w:numFmt w:val="bullet"/>
-      <w:lvlText w:val="■"/>
-      <w:lvlJc w:val="left"/>
-      <w:pPr>
-        <w:ind w:left="2160" w:hanging="360"/>
-      </w:pPr>
-      <w:rPr>
-        <w:u w:val="none"/>
-      </w:rPr>
-    </w:lvl>
-    <w:lvl w:ilvl="3">
-      <w:start w:val="1"/>
-      <w:numFmt w:val="bullet"/>
-      <w:lvlText w:val="●"/>
-      <w:lvlJc w:val="left"/>
-      <w:pPr>
-        <w:ind w:left="2880" w:hanging="360"/>
-      </w:pPr>
-      <w:rPr>
-        <w:u w:val="none"/>
-      </w:rPr>
-    </w:lvl>
-    <w:lvl w:ilvl="4">
-      <w:start w:val="1"/>
-      <w:numFmt w:val="bullet"/>
-      <w:lvlText w:val="○"/>
-      <w:lvlJc w:val="left"/>
-      <w:pPr>
-        <w:ind w:left="3600" w:hanging="360"/>
-      </w:pPr>
-      <w:rPr>
-        <w:u w:val="none"/>
-      </w:rPr>
-    </w:lvl>
-    <w:lvl w:ilvl="5">
-      <w:start w:val="1"/>
-      <w:numFmt w:val="bullet"/>
-      <w:lvlText w:val="■"/>
-      <w:lvlJc w:val="left"/>
-      <w:pPr>
-        <w:ind w:left="4320" w:hanging="360"/>
-      </w:pPr>
-      <w:rPr>
-        <w:u w:val="none"/>
-      </w:rPr>
-    </w:lvl>
-    <w:lvl w:ilvl="6">
-      <w:start w:val="1"/>
-      <w:numFmt w:val="bullet"/>
-      <w:lvlText w:val="●"/>
-      <w:lvlJc w:val="left"/>
-      <w:pPr>
-        <w:ind w:left="5040" w:hanging="360"/>
-      </w:pPr>
-      <w:rPr>
-        <w:u w:val="none"/>
-      </w:rPr>
-    </w:lvl>
-    <w:lvl w:ilvl="7">
-      <w:start w:val="1"/>
-      <w:numFmt w:val="bullet"/>
-      <w:lvlText w:val="○"/>
-      <w:lvlJc w:val="left"/>
-      <w:pPr>
-        <w:ind w:left="5760" w:hanging="360"/>
-      </w:pPr>
-      <w:rPr>
-        <w:u w:val="none"/>
-      </w:rPr>
-    </w:lvl>
-    <w:lvl w:ilvl="8">
-      <w:start w:val="1"/>
-      <w:numFmt w:val="bullet"/>
-      <w:lvlText w:val="■"/>
-      <w:lvlJc w:val="left"/>
-      <w:pPr>
-        <w:ind w:left="6480" w:hanging="360"/>
-      </w:pPr>
-      <w:rPr>
-        <w:u w:val="none"/>
-      </w:rPr>
-    </w:lvl>
-  </w:abstractNum>
-  <w:abstractNum w:abstractNumId="4">
-    <w:lvl w:ilvl="0">
-      <w:start w:val="1"/>
-      <w:numFmt w:val="bullet"/>
-      <w:lvlText w:val="●"/>
-      <w:lvlJc w:val="left"/>
-      <w:pPr>
-        <w:ind w:left="720" w:hanging="360"/>
-      </w:pPr>
-      <w:rPr>
         <w:u w:val="none"/>
       </w:rPr>
     </w:lvl>
@@ -1979,9 +4602,6 @@
   </w:num>
   <w:num w:numId="3">
     <w:abstractNumId w:val="3"/>
-  </w:num>
-  <w:num w:numId="4">
-    <w:abstractNumId w:val="4"/>
   </w:num>
 </w:numbering>
 </file>
@@ -2150,6 +4770,20 @@
       <w:sz w:val="30"/>
       <w:szCs w:val="30"/>
     </w:rPr>
+  </w:style>
+  <w:style w:type="table" w:styleId="Table1">
+    <w:basedOn w:val="TableNormal"/>
+    <w:tblPr>
+      <w:tblStyleRowBandSize w:val="1"/>
+      <w:tblStyleColBandSize w:val="1"/>
+    </w:tblPr>
+  </w:style>
+  <w:style w:type="table" w:styleId="Table2">
+    <w:basedOn w:val="TableNormal"/>
+    <w:tblPr>
+      <w:tblStyleRowBandSize w:val="1"/>
+      <w:tblStyleColBandSize w:val="1"/>
+    </w:tblPr>
   </w:style>
 </w:styles>
 </file>

</xml_diff>